<commit_message>
update S2 legend; S3 figure order and legend.
</commit_message>
<xml_diff>
--- a/Sup Figures/Supplementary Figure Legend.docx
+++ b/Sup Figures/Supplementary Figure Legend.docx
@@ -1,44 +1,26 @@
 
 <file path=word/document.xml><?xml version="1.0" encoding="utf-8"?>
-<w:document xmlns:o="urn:schemas-microsoft-com:office:office" xmlns:r="http://schemas.openxmlformats.org/officeDocument/2006/relationships" xmlns:v="urn:schemas-microsoft-com:vml" xmlns:w="http://schemas.openxmlformats.org/wordprocessingml/2006/main" xmlns:w10="urn:schemas-microsoft-com:office:word" xmlns:wp="http://schemas.openxmlformats.org/drawingml/2006/wordprocessingDrawing" xmlns:pic="http://schemas.openxmlformats.org/drawingml/2006/picture" xmlns:wps="http://schemas.microsoft.com/office/word/2010/wordprocessingShape" xmlns:wpg="http://schemas.microsoft.com/office/word/2010/wordprocessingGroup" xmlns:mc="http://schemas.openxmlformats.org/markup-compatibility/2006" xmlns:wp14="http://schemas.microsoft.com/office/word/2010/wordprocessingDrawing" xmlns:w14="http://schemas.microsoft.com/office/word/2010/wordml" xmlns:w15="http://schemas.microsoft.com/office/word/2012/wordml" mc:Ignorable="w14 wp14 w15">
+<w:document xmlns:wpc="http://schemas.microsoft.com/office/word/2010/wordprocessingCanvas" xmlns:cx="http://schemas.microsoft.com/office/drawing/2014/chartex" xmlns:cx1="http://schemas.microsoft.com/office/drawing/2015/9/8/chartex" xmlns:cx2="http://schemas.microsoft.com/office/drawing/2015/10/21/chartex" xmlns:cx3="http://schemas.microsoft.com/office/drawing/2016/5/9/chartex" xmlns:cx4="http://schemas.microsoft.com/office/drawing/2016/5/10/chartex" xmlns:cx5="http://schemas.microsoft.com/office/drawing/2016/5/11/chartex" xmlns:cx6="http://schemas.microsoft.com/office/drawing/2016/5/12/chartex" xmlns:cx7="http://schemas.microsoft.com/office/drawing/2016/5/13/chartex" xmlns:cx8="http://schemas.microsoft.com/office/drawing/2016/5/14/chartex" xmlns:mc="http://schemas.openxmlformats.org/markup-compatibility/2006" xmlns:aink="http://schemas.microsoft.com/office/drawing/2016/ink" xmlns:am3d="http://schemas.microsoft.com/office/drawing/2017/model3d" xmlns:o="urn:schemas-microsoft-com:office:office" xmlns:oel="http://schemas.microsoft.com/office/2019/extlst" xmlns:r="http://schemas.openxmlformats.org/officeDocument/2006/relationships" xmlns:m="http://schemas.openxmlformats.org/officeDocument/2006/math" xmlns:v="urn:schemas-microsoft-com:vml" xmlns:wp14="http://schemas.microsoft.com/office/word/2010/wordprocessingDrawing" xmlns:wp="http://schemas.openxmlformats.org/drawingml/2006/wordprocessingDrawing" xmlns:w10="urn:schemas-microsoft-com:office:word" xmlns:w="http://schemas.openxmlformats.org/wordprocessingml/2006/main" xmlns:w14="http://schemas.microsoft.com/office/word/2010/wordml" xmlns:w15="http://schemas.microsoft.com/office/word/2012/wordml" xmlns:w16cex="http://schemas.microsoft.com/office/word/2018/wordml/cex" xmlns:w16cid="http://schemas.microsoft.com/office/word/2016/wordml/cid" xmlns:w16="http://schemas.microsoft.com/office/word/2018/wordml" xmlns:w16du="http://schemas.microsoft.com/office/word/2023/wordml/word16du" xmlns:w16sdtdh="http://schemas.microsoft.com/office/word/2020/wordml/sdtdatahash" xmlns:w16sdtfl="http://schemas.microsoft.com/office/word/2024/wordml/sdtformatlock" xmlns:w16se="http://schemas.microsoft.com/office/word/2015/wordml/symex" xmlns:wpg="http://schemas.microsoft.com/office/word/2010/wordprocessingGroup" xmlns:wpi="http://schemas.microsoft.com/office/word/2010/wordprocessingInk" xmlns:wne="http://schemas.microsoft.com/office/word/2006/wordml" xmlns:wps="http://schemas.microsoft.com/office/word/2010/wordprocessingShape" mc:Ignorable="w14 w15 w16se w16cid w16 w16cex w16sdtdh w16sdtfl w16du wp14">
   <w:body>
     <w:p>
       <w:pPr>
-        <w:pStyle w:val="Normal"/>
-        <w:rPr>
-          <w:rFonts w:ascii="Times New Roman" w:hAnsi="Times New Roman" w:cs="Times New Roman" w:hint="eastAsia"/>
+        <w:rPr>
+          <w:rFonts w:ascii="Times New Roman" w:hAnsi="Times New Roman" w:cs="Times New Roman"/>
           <w:b/>
           <w:bCs/>
         </w:rPr>
       </w:pPr>
       <w:r>
         <w:rPr>
-          <w:rFonts w:cs="Times New Roman" w:hint="eastAsia" w:ascii="Times New Roman" w:hAnsi="Times New Roman"/>
-          <w:b/>
-          <w:bCs/>
-        </w:rPr>
-        <w:t xml:space="preserve">Figure S1 Attribution across cancer types of 83-type </w:t>
-      </w:r>
-      <w:r>
-        <w:rPr>
-          <w:rFonts w:cs="Times New Roman" w:hint="eastAsia" w:ascii="Times New Roman" w:hAnsi="Times New Roman"/>
-          <w:b/>
-          <w:bCs/>
-        </w:rPr>
-        <w:t xml:space="preserve">and 89-ttype </w:t>
-      </w:r>
-      <w:r>
-        <w:rPr>
-          <w:rFonts w:cs="Times New Roman" w:hint="eastAsia" w:ascii="Times New Roman" w:hAnsi="Times New Roman"/>
-          <w:b/>
-          <w:bCs/>
-        </w:rPr>
-        <w:t xml:space="preserve">indel signatures </w:t>
+          <w:rFonts w:ascii="Times New Roman" w:hAnsi="Times New Roman" w:cs="Times New Roman" w:hint="eastAsia"/>
+          <w:b/>
+          <w:bCs/>
+        </w:rPr>
+        <w:t xml:space="preserve">Figure S1 Attribution across cancer types of 83-type and 89-ttype indel signatures </w:t>
       </w:r>
     </w:p>
     <w:p>
       <w:pPr>
-        <w:pStyle w:val="Normal"/>
         <w:rPr>
           <w:rFonts w:ascii="Times New Roman" w:hAnsi="Times New Roman" w:cs="Times New Roman"/>
           <w:b/>
@@ -47,26 +29,25 @@
       </w:pPr>
       <w:r>
         <w:rPr>
-          <w:rFonts w:cs="Times New Roman" w:hint="eastAsia" w:ascii="Times New Roman" w:hAnsi="Times New Roman"/>
+          <w:rFonts w:ascii="Times New Roman" w:hAnsi="Times New Roman" w:cs="Times New Roman" w:hint="eastAsia"/>
         </w:rPr>
         <w:t xml:space="preserve">The size of each dot represents the proportion of genomes with exposures to the signature in the cancer type indicated at the top of the x axis. The color indicates the median </w:t>
       </w:r>
       <w:r>
         <w:rPr>
-          <w:rFonts w:cs="Times New Roman" w:ascii="Times New Roman" w:hAnsi="Times New Roman"/>
+          <w:rFonts w:ascii="Times New Roman" w:hAnsi="Times New Roman" w:cs="Times New Roman"/>
         </w:rPr>
         <w:t xml:space="preserve">number of mutations due to the exposure per megabase </w:t>
       </w:r>
       <w:r>
         <w:rPr>
-          <w:rFonts w:cs="Times New Roman" w:hint="eastAsia" w:ascii="Times New Roman" w:hAnsi="Times New Roman"/>
+          <w:rFonts w:ascii="Times New Roman" w:hAnsi="Times New Roman" w:cs="Times New Roman" w:hint="eastAsia"/>
         </w:rPr>
         <w:t>of the given signature in the given cancer type.</w:t>
       </w:r>
     </w:p>
     <w:p>
       <w:pPr>
-        <w:pStyle w:val="Normal"/>
         <w:rPr>
           <w:rFonts w:ascii="Times New Roman" w:hAnsi="Times New Roman" w:cs="Times New Roman"/>
           <w:b/>
@@ -75,7 +56,7 @@
       </w:pPr>
       <w:r>
         <w:rPr>
-          <w:rFonts w:cs="Times New Roman" w:hint="eastAsia" w:ascii="Times New Roman" w:hAnsi="Times New Roman"/>
+          <w:rFonts w:ascii="Times New Roman" w:hAnsi="Times New Roman" w:cs="Times New Roman" w:hint="eastAsia"/>
           <w:b/>
           <w:bCs/>
         </w:rPr>
@@ -83,7 +64,7 @@
       </w:r>
       <w:r>
         <w:rPr>
-          <w:rFonts w:cs="Times New Roman" w:ascii="Times New Roman" w:hAnsi="Times New Roman"/>
+          <w:rFonts w:ascii="Times New Roman" w:hAnsi="Times New Roman" w:cs="Times New Roman"/>
           <w:b/>
           <w:bCs/>
         </w:rPr>
@@ -91,7 +72,7 @@
       </w:r>
       <w:r>
         <w:rPr>
-          <w:rFonts w:cs="Times New Roman" w:hint="eastAsia" w:ascii="Times New Roman" w:hAnsi="Times New Roman"/>
+          <w:rFonts w:ascii="Times New Roman" w:hAnsi="Times New Roman" w:cs="Times New Roman" w:hint="eastAsia"/>
           <w:b/>
           <w:bCs/>
         </w:rPr>
@@ -99,138 +80,232 @@
       </w:r>
       <w:r>
         <w:rPr>
-          <w:rFonts w:cs="Times New Roman" w:ascii="Times New Roman" w:hAnsi="Times New Roman"/>
-          <w:b/>
-          <w:bCs/>
-        </w:rPr>
-        <w:t xml:space="preserve"> C_ID11, C_ID13, C_ID16, and ID_C.</w:t>
+          <w:rFonts w:ascii="Times New Roman" w:hAnsi="Times New Roman" w:cs="Times New Roman"/>
+          <w:b/>
+          <w:bCs/>
+        </w:rPr>
+        <w:t xml:space="preserve"> </w:t>
+      </w:r>
+      <w:r>
+        <w:rPr>
+          <w:rFonts w:ascii="Times New Roman" w:hAnsi="Times New Roman" w:cs="Times New Roman" w:hint="eastAsia"/>
+          <w:b/>
+          <w:bCs/>
+        </w:rPr>
+        <w:t>C_ID13 vs ID_C, C_ID11 vs C_ID16 and C_ID9 vs ID_A</w:t>
+      </w:r>
+      <w:r>
+        <w:rPr>
+          <w:rFonts w:ascii="Times New Roman" w:hAnsi="Times New Roman" w:cs="Times New Roman"/>
+          <w:b/>
+          <w:bCs/>
+        </w:rPr>
+        <w:t>.</w:t>
       </w:r>
     </w:p>
     <w:p>
       <w:pPr>
-        <w:pStyle w:val="Normal"/>
-        <w:bidi w:val="0"/>
         <w:rPr>
           <w:rFonts w:ascii="Times New Roman" w:hAnsi="Times New Roman" w:cs="Times New Roman"/>
         </w:rPr>
       </w:pPr>
       <w:r>
         <w:rPr>
-          <w:rFonts w:cs="Times New Roman" w:ascii="Times New Roman" w:hAnsi="Times New Roman"/>
+          <w:rFonts w:ascii="Times New Roman" w:hAnsi="Times New Roman" w:cs="Times New Roman"/>
         </w:rPr>
         <w:t>(A) Divergent sequence contexts for C_ID13 and ID_C. Top to bottom: 83-type, 89-type, and partial 476-type representations</w:t>
       </w:r>
       <w:r>
         <w:rPr>
-          <w:rFonts w:cs="Times New Roman" w:hint="eastAsia" w:ascii="Times New Roman" w:hAnsi="Times New Roman"/>
+          <w:rFonts w:ascii="Times New Roman" w:hAnsi="Times New Roman" w:cs="Times New Roman" w:hint="eastAsia"/>
         </w:rPr>
         <w:t xml:space="preserve"> </w:t>
       </w:r>
       <w:r>
         <w:rPr>
-          <w:rFonts w:cs="Times New Roman" w:ascii="Times New Roman" w:hAnsi="Times New Roman"/>
+          <w:rFonts w:ascii="Times New Roman" w:hAnsi="Times New Roman" w:cs="Times New Roman"/>
         </w:rPr>
         <w:t xml:space="preserve">(1-bp C and T </w:t>
       </w:r>
       <w:r>
         <w:rPr>
-          <w:rFonts w:cs="Times New Roman" w:hint="eastAsia" w:ascii="Times New Roman" w:hAnsi="Times New Roman"/>
+          <w:rFonts w:ascii="Times New Roman" w:hAnsi="Times New Roman" w:cs="Times New Roman" w:hint="eastAsia"/>
         </w:rPr>
         <w:t>deletions were displayed</w:t>
       </w:r>
       <w:r>
         <w:rPr>
-          <w:rFonts w:cs="Times New Roman" w:ascii="Times New Roman" w:hAnsi="Times New Roman"/>
+          <w:rFonts w:ascii="Times New Roman" w:hAnsi="Times New Roman" w:cs="Times New Roman"/>
         </w:rPr>
         <w:t>).</w:t>
       </w:r>
       <w:r>
         <w:rPr>
-          <w:rFonts w:cs="Times New Roman" w:hint="eastAsia" w:ascii="Times New Roman" w:hAnsi="Times New Roman"/>
+          <w:rFonts w:ascii="Times New Roman" w:hAnsi="Times New Roman" w:cs="Times New Roman" w:hint="eastAsia"/>
         </w:rPr>
         <w:t xml:space="preserve"> </w:t>
       </w:r>
       <w:r>
         <w:rPr>
-          <w:rFonts w:cs="Times New Roman" w:ascii="Times New Roman" w:hAnsi="Times New Roman"/>
+          <w:rFonts w:ascii="Times New Roman" w:hAnsi="Times New Roman" w:cs="Times New Roman"/>
         </w:rPr>
         <w:t>While 89-type profiles exhibit high similarity between the two signatures, the 476-type classification reveals distinct flanking sequence preferences. Specifically, C_ID13 (InsDel13) demonstrates a predilection for ATTA and GTTA motifs, whereas ID_C (InsDel_C) preferentially occurs at ATA and GTA contexts.</w:t>
       </w:r>
     </w:p>
     <w:p>
       <w:pPr>
-        <w:pStyle w:val="Normal"/>
         <w:rPr>
           <w:rFonts w:ascii="Times New Roman" w:hAnsi="Times New Roman" w:cs="Times New Roman"/>
         </w:rPr>
       </w:pPr>
       <w:r>
         <w:rPr>
-          <w:rFonts w:cs="Times New Roman" w:ascii="Times New Roman" w:hAnsi="Times New Roman"/>
+          <w:rFonts w:ascii="Times New Roman" w:hAnsi="Times New Roman" w:cs="Times New Roman"/>
         </w:rPr>
         <w:t>(B) Divergent sequence contexts for C_ID</w:t>
       </w:r>
       <w:r>
         <w:rPr>
-          <w:rFonts w:cs="Times New Roman" w:hint="eastAsia" w:ascii="Times New Roman" w:hAnsi="Times New Roman"/>
+          <w:rFonts w:ascii="Times New Roman" w:hAnsi="Times New Roman" w:cs="Times New Roman" w:hint="eastAsia"/>
         </w:rPr>
         <w:t>11</w:t>
       </w:r>
       <w:r>
         <w:rPr>
-          <w:rFonts w:cs="Times New Roman" w:ascii="Times New Roman" w:hAnsi="Times New Roman"/>
+          <w:rFonts w:ascii="Times New Roman" w:hAnsi="Times New Roman" w:cs="Times New Roman"/>
         </w:rPr>
         <w:t xml:space="preserve"> and </w:t>
       </w:r>
       <w:r>
         <w:rPr>
-          <w:rFonts w:cs="Times New Roman" w:hint="eastAsia" w:ascii="Times New Roman" w:hAnsi="Times New Roman"/>
+          <w:rFonts w:ascii="Times New Roman" w:hAnsi="Times New Roman" w:cs="Times New Roman" w:hint="eastAsia"/>
         </w:rPr>
         <w:t>C_ID16</w:t>
       </w:r>
       <w:r>
         <w:rPr>
-          <w:rFonts w:cs="Times New Roman" w:ascii="Times New Roman" w:hAnsi="Times New Roman"/>
+          <w:rFonts w:ascii="Times New Roman" w:hAnsi="Times New Roman" w:cs="Times New Roman"/>
         </w:rPr>
         <w:t>. Top to bottom: 83-type, 89-type, and partial 476-type representations (1-bp C and T insertions</w:t>
       </w:r>
       <w:r>
         <w:rPr>
-          <w:rFonts w:cs="Times New Roman" w:hint="eastAsia" w:ascii="Times New Roman" w:hAnsi="Times New Roman"/>
+          <w:rFonts w:ascii="Times New Roman" w:hAnsi="Times New Roman" w:cs="Times New Roman" w:hint="eastAsia"/>
         </w:rPr>
         <w:t xml:space="preserve"> were displayed</w:t>
       </w:r>
       <w:r>
         <w:rPr>
-          <w:rFonts w:cs="Times New Roman" w:ascii="Times New Roman" w:hAnsi="Times New Roman"/>
+          <w:rFonts w:ascii="Times New Roman" w:hAnsi="Times New Roman" w:cs="Times New Roman"/>
         </w:rPr>
         <w:t>). While 89-type profiles exhibit high similarity between the two signatures, the 476-type classification reveals distinct flanking sequence preferences. Specifically: C_ID11 (InsDel11) exhibits a specific preference for 1-bp T insertions within NTN motifs, while C_ID16 (InsDel16) shows a broader preference for NN contexts.</w:t>
       </w:r>
     </w:p>
     <w:p>
       <w:pPr>
-        <w:pStyle w:val="Normal"/>
-        <w:rPr>
-          <w:rFonts w:ascii="Times New Roman" w:hAnsi="Times New Roman" w:cs="Times New Roman"/>
+        <w:rPr>
+          <w:rFonts w:ascii="Times New Roman" w:hAnsi="Times New Roman" w:cs="Times New Roman" w:hint="eastAsia"/>
         </w:rPr>
       </w:pPr>
       <w:r>
         <w:rPr>
-          <w:rFonts w:cs="Times New Roman" w:ascii="Times New Roman" w:hAnsi="Times New Roman"/>
+          <w:rFonts w:ascii="Times New Roman" w:hAnsi="Times New Roman" w:cs="Times New Roman"/>
         </w:rPr>
         <w:t xml:space="preserve">(C) </w:t>
       </w:r>
       <w:r>
         <w:rPr>
-          <w:rFonts w:cs="Times New Roman" w:ascii="Times New Roman" w:hAnsi="Times New Roman"/>
-          <w:shd w:fill="FF0000" w:val="clear"/>
-        </w:rPr>
-        <w:t>NEED</w:t>
+          <w:rFonts w:ascii="Times New Roman" w:hAnsi="Times New Roman" w:cs="Times New Roman"/>
+        </w:rPr>
+        <w:t>Divergent sequence contexts for C_ID</w:t>
+      </w:r>
+      <w:r>
+        <w:rPr>
+          <w:rFonts w:ascii="Times New Roman" w:hAnsi="Times New Roman" w:cs="Times New Roman" w:hint="eastAsia"/>
+        </w:rPr>
+        <w:t>9/InsDel9</w:t>
+      </w:r>
+      <w:r>
+        <w:rPr>
+          <w:rFonts w:ascii="Times New Roman" w:hAnsi="Times New Roman" w:cs="Times New Roman"/>
+        </w:rPr>
+        <w:t xml:space="preserve"> and ID_</w:t>
+      </w:r>
+      <w:r>
+        <w:rPr>
+          <w:rFonts w:ascii="Times New Roman" w:hAnsi="Times New Roman" w:cs="Times New Roman" w:hint="eastAsia"/>
+        </w:rPr>
+        <w:t>A/InsDel_A</w:t>
+      </w:r>
+      <w:r>
+        <w:rPr>
+          <w:rFonts w:ascii="Times New Roman" w:hAnsi="Times New Roman" w:cs="Times New Roman"/>
+        </w:rPr>
+        <w:t>β</w:t>
+      </w:r>
+      <w:r>
+        <w:rPr>
+          <w:rFonts w:ascii="Times New Roman" w:hAnsi="Times New Roman" w:cs="Times New Roman"/>
+        </w:rPr>
+        <w:t>. Top to bottom: 83-type, 89-type, and partial 476-type representations</w:t>
+      </w:r>
+      <w:r>
+        <w:rPr>
+          <w:rFonts w:ascii="Times New Roman" w:hAnsi="Times New Roman" w:cs="Times New Roman" w:hint="eastAsia"/>
+        </w:rPr>
+        <w:t xml:space="preserve"> </w:t>
+      </w:r>
+      <w:r>
+        <w:rPr>
+          <w:rFonts w:ascii="Times New Roman" w:hAnsi="Times New Roman" w:cs="Times New Roman"/>
+        </w:rPr>
+        <w:t xml:space="preserve">(1-bp C and T </w:t>
+      </w:r>
+      <w:r>
+        <w:rPr>
+          <w:rFonts w:ascii="Times New Roman" w:hAnsi="Times New Roman" w:cs="Times New Roman" w:hint="eastAsia"/>
+        </w:rPr>
+        <w:t>deletions were displayed</w:t>
+      </w:r>
+      <w:r>
+        <w:rPr>
+          <w:rFonts w:ascii="Times New Roman" w:hAnsi="Times New Roman" w:cs="Times New Roman"/>
+        </w:rPr>
+        <w:t>).</w:t>
+      </w:r>
+      <w:r>
+        <w:rPr>
+          <w:rFonts w:ascii="Times New Roman" w:hAnsi="Times New Roman" w:cs="Times New Roman" w:hint="eastAsia"/>
+        </w:rPr>
+        <w:t xml:space="preserve"> </w:t>
+      </w:r>
+      <w:r>
+        <w:rPr>
+          <w:rFonts w:ascii="Times New Roman" w:hAnsi="Times New Roman" w:cs="Times New Roman"/>
+        </w:rPr>
+        <w:t xml:space="preserve">Compared with C_ID9, ID_A is nearly </w:t>
+      </w:r>
+      <w:r>
+        <w:rPr>
+          <w:rFonts w:ascii="Times New Roman" w:hAnsi="Times New Roman" w:cs="Times New Roman" w:hint="eastAsia"/>
+        </w:rPr>
+        <w:t>depleted</w:t>
+      </w:r>
+      <w:r>
+        <w:rPr>
+          <w:rFonts w:ascii="Times New Roman" w:hAnsi="Times New Roman" w:cs="Times New Roman"/>
+        </w:rPr>
+        <w:t xml:space="preserve"> of 1-bp T deletions. Although the 83-channel profiles show similar patterns of 1-bp C deletions, the 89- and 476-channel classifications reveal distinct preferences for flanking sequences. In particular, InsDel_Aβ preferentially exhibits 1-bp C deletions in TCA and TCT contexts</w:t>
+      </w:r>
+      <w:r>
+        <w:rPr>
+          <w:rFonts w:ascii="Times New Roman" w:hAnsi="Times New Roman" w:cs="Times New Roman" w:hint="eastAsia"/>
+        </w:rPr>
+        <w:t xml:space="preserve">. </w:t>
       </w:r>
     </w:p>
     <w:p>
       <w:pPr>
-        <w:pStyle w:val="Normal"/>
         <w:rPr>
           <w:rFonts w:ascii="Times New Roman" w:hAnsi="Times New Roman" w:cs="Times New Roman"/>
           <w:b/>
@@ -239,7 +314,7 @@
       </w:pPr>
       <w:r>
         <w:rPr>
-          <w:rFonts w:cs="Times New Roman" w:hint="eastAsia" w:ascii="Times New Roman" w:hAnsi="Times New Roman"/>
+          <w:rFonts w:ascii="Times New Roman" w:hAnsi="Times New Roman" w:cs="Times New Roman" w:hint="eastAsia"/>
           <w:b/>
           <w:bCs/>
         </w:rPr>
@@ -247,7 +322,7 @@
       </w:r>
       <w:r>
         <w:rPr>
-          <w:rFonts w:cs="Times New Roman" w:ascii="Times New Roman" w:hAnsi="Times New Roman"/>
+          <w:rFonts w:ascii="Times New Roman" w:hAnsi="Times New Roman" w:cs="Times New Roman"/>
           <w:b/>
           <w:bCs/>
         </w:rPr>
@@ -255,7 +330,7 @@
       </w:r>
       <w:r>
         <w:rPr>
-          <w:rFonts w:cs="Times New Roman" w:hint="eastAsia" w:ascii="Times New Roman" w:hAnsi="Times New Roman"/>
+          <w:rFonts w:ascii="Times New Roman" w:hAnsi="Times New Roman" w:cs="Times New Roman" w:hint="eastAsia"/>
           <w:b/>
           <w:bCs/>
         </w:rPr>
@@ -263,7 +338,7 @@
       </w:r>
       <w:r>
         <w:rPr>
-          <w:rFonts w:cs="Times New Roman" w:ascii="Times New Roman" w:hAnsi="Times New Roman"/>
+          <w:rFonts w:ascii="Times New Roman" w:hAnsi="Times New Roman" w:cs="Times New Roman"/>
           <w:b/>
           <w:bCs/>
         </w:rPr>
@@ -271,7 +346,7 @@
       </w:r>
       <w:r>
         <w:rPr>
-          <w:rFonts w:cs="Times New Roman" w:hint="eastAsia" w:ascii="Times New Roman" w:hAnsi="Times New Roman"/>
+          <w:rFonts w:ascii="Times New Roman" w:hAnsi="Times New Roman" w:cs="Times New Roman" w:hint="eastAsia"/>
           <w:b/>
           <w:bCs/>
         </w:rPr>
@@ -279,7 +354,7 @@
       </w:r>
       <w:r>
         <w:rPr>
-          <w:rFonts w:cs="Times New Roman" w:ascii="Times New Roman" w:hAnsi="Times New Roman"/>
+          <w:rFonts w:ascii="Times New Roman" w:hAnsi="Times New Roman" w:cs="Times New Roman"/>
           <w:b/>
           <w:bCs/>
         </w:rPr>
@@ -288,109 +363,94 @@
     </w:p>
     <w:p>
       <w:pPr>
-        <w:pStyle w:val="Normal"/>
         <w:rPr>
           <w:rFonts w:ascii="Times New Roman" w:hAnsi="Times New Roman" w:cs="Times New Roman"/>
         </w:rPr>
       </w:pPr>
       <w:r>
         <w:rPr>
-          <w:rFonts w:cs="Times New Roman" w:ascii="Times New Roman" w:hAnsi="Times New Roman"/>
-        </w:rPr>
-        <w:t xml:space="preserve">(A) Enrichment of mutations in genic and intergenic regions for </w:t>
-      </w:r>
-      <w:r>
-        <w:rPr>
-          <w:rFonts w:cs="Times New Roman" w:hint="eastAsia" w:ascii="Times New Roman" w:hAnsi="Times New Roman"/>
-        </w:rPr>
-        <w:t>83-type</w:t>
-      </w:r>
-      <w:r>
-        <w:rPr>
-          <w:rFonts w:cs="Times New Roman" w:ascii="Times New Roman" w:hAnsi="Times New Roman"/>
-        </w:rPr>
-        <w:t xml:space="preserve"> signatures. Each row represents one </w:t>
-      </w:r>
-      <w:r>
-        <w:rPr>
-          <w:rFonts w:cs="Times New Roman" w:hint="eastAsia" w:ascii="Times New Roman" w:hAnsi="Times New Roman"/>
-        </w:rPr>
-        <w:t>83-type</w:t>
-      </w:r>
-      <w:r>
-        <w:rPr>
-          <w:rFonts w:cs="Times New Roman" w:ascii="Times New Roman" w:hAnsi="Times New Roman"/>
-        </w:rPr>
-        <w:t xml:space="preserve"> signature, and each column displays a cancer type. Signatures enriched in genic and intergenic regions are shown in circles with yellow and light blue colors, respectively. Significance of enrichment was shown as stars (Fisher’s exact test, * p &lt; 0.05, ** p &lt; 0.01, *** p &lt; 0.001).</w:t>
-      </w:r>
-      <w:r>
-        <w:rPr>
-          <w:rFonts w:cs="Times New Roman" w:hint="eastAsia" w:ascii="Times New Roman" w:hAnsi="Times New Roman"/>
+          <w:rFonts w:ascii="Times New Roman" w:hAnsi="Times New Roman" w:cs="Times New Roman"/>
+        </w:rPr>
+        <w:t xml:space="preserve">(A) </w:t>
+      </w:r>
+      <w:r>
+        <w:rPr>
+          <w:rFonts w:ascii="Times New Roman" w:hAnsi="Times New Roman" w:cs="Times New Roman"/>
+        </w:rPr>
+        <w:t xml:space="preserve">Transcription-strand asymmetries of 83-type signatures. Each row represents an 83-type signature, and each column represents a cancer type. Red and dark blue circles indicate enrichment on the transcribed and untranscribed strands, respectively. </w:t>
+      </w:r>
+      <w:r>
+        <w:rPr>
+          <w:rFonts w:ascii="Times New Roman" w:hAnsi="Times New Roman" w:cs="Times New Roman"/>
+        </w:rPr>
+        <w:t>Significance of enrichment was shown as stars (Fisher’s exact test, * p &lt; 0.05, ** p &lt; 0.01, *** p &lt; 0.001).</w:t>
+      </w:r>
+      <w:r>
+        <w:rPr>
+          <w:rFonts w:ascii="Times New Roman" w:hAnsi="Times New Roman" w:cs="Times New Roman" w:hint="eastAsia"/>
         </w:rPr>
         <w:t xml:space="preserve"> </w:t>
       </w:r>
       <w:r>
         <w:rPr>
-          <w:rFonts w:cs="Times New Roman" w:ascii="Times New Roman" w:hAnsi="Times New Roman"/>
+          <w:rFonts w:ascii="Times New Roman" w:hAnsi="Times New Roman" w:cs="Times New Roman"/>
         </w:rPr>
         <w:t xml:space="preserve">Color intensities and Circle sizes represent the odds ratio between the ratio of real mutations and the ratio of simulated mutations (See Methods). </w:t>
       </w:r>
     </w:p>
     <w:p>
       <w:pPr>
-        <w:pStyle w:val="Normal"/>
         <w:rPr>
           <w:rFonts w:ascii="Times New Roman" w:hAnsi="Times New Roman" w:cs="Times New Roman"/>
         </w:rPr>
       </w:pPr>
       <w:r>
         <w:rPr>
-          <w:rFonts w:cs="Times New Roman" w:ascii="Times New Roman" w:hAnsi="Times New Roman"/>
+          <w:rFonts w:ascii="Times New Roman" w:hAnsi="Times New Roman" w:cs="Times New Roman"/>
         </w:rPr>
         <w:t xml:space="preserve">(B) Replication strand asymmetries of </w:t>
       </w:r>
       <w:r>
         <w:rPr>
-          <w:rFonts w:cs="Times New Roman" w:hint="eastAsia" w:ascii="Times New Roman" w:hAnsi="Times New Roman"/>
+          <w:rFonts w:ascii="Times New Roman" w:hAnsi="Times New Roman" w:cs="Times New Roman" w:hint="eastAsia"/>
         </w:rPr>
         <w:t>83-type</w:t>
       </w:r>
       <w:r>
         <w:rPr>
-          <w:rFonts w:cs="Times New Roman" w:ascii="Times New Roman" w:hAnsi="Times New Roman"/>
+          <w:rFonts w:ascii="Times New Roman" w:hAnsi="Times New Roman" w:cs="Times New Roman"/>
         </w:rPr>
         <w:t xml:space="preserve"> signatures. Data are presented in a format similar to the one in panel (A), with green and orange colors indicating replication strand asymmetries on the lagging and leading strands, respectively.</w:t>
       </w:r>
     </w:p>
     <w:p>
       <w:pPr>
-        <w:pStyle w:val="Normal"/>
         <w:rPr>
           <w:rFonts w:ascii="Times New Roman" w:hAnsi="Times New Roman" w:cs="Times New Roman"/>
         </w:rPr>
       </w:pPr>
       <w:r>
         <w:rPr>
-          <w:rFonts w:cs="Times New Roman" w:ascii="Times New Roman" w:hAnsi="Times New Roman"/>
-        </w:rPr>
-        <w:t xml:space="preserve">(C) Transcription strand asymmetries of </w:t>
-      </w:r>
-      <w:r>
-        <w:rPr>
-          <w:rFonts w:cs="Times New Roman" w:hint="eastAsia" w:ascii="Times New Roman" w:hAnsi="Times New Roman"/>
-        </w:rPr>
-        <w:t>83-type</w:t>
-      </w:r>
-      <w:r>
-        <w:rPr>
-          <w:rFonts w:cs="Times New Roman" w:ascii="Times New Roman" w:hAnsi="Times New Roman"/>
-        </w:rPr>
-        <w:t xml:space="preserve"> signatures. Data are presented in a format similar to the one in panel (A), with red and dark blue colors indicating transcription strand asymmetries on the transcribed and untranscribed strands, respectively.</w:t>
+          <w:rFonts w:ascii="Times New Roman" w:hAnsi="Times New Roman" w:cs="Times New Roman"/>
+        </w:rPr>
+        <w:lastRenderedPageBreak/>
+        <w:t xml:space="preserve">(C) </w:t>
+      </w:r>
+      <w:r>
+        <w:rPr>
+          <w:rFonts w:ascii="Times New Roman" w:hAnsi="Times New Roman" w:cs="Times New Roman"/>
+        </w:rPr>
+        <w:t>Enrichment of mutations in genic and intergenic regions for 83-type signatures.</w:t>
+      </w:r>
+      <w:r>
+        <w:rPr>
+          <w:rFonts w:ascii="Times New Roman" w:hAnsi="Times New Roman" w:cs="Times New Roman"/>
+        </w:rPr>
+        <w:t xml:space="preserve"> Data are presented in a format similar to the one in panel (A), with red and dark blue colors indicating transcription strand asymmetries on the transcribed and untranscribed strands, respectively.</w:t>
       </w:r>
     </w:p>
     <w:p>
       <w:pPr>
-        <w:pStyle w:val="Normal"/>
         <w:rPr>
           <w:rFonts w:ascii="Times New Roman" w:hAnsi="Times New Roman" w:cs="Times New Roman"/>
           <w:b/>
@@ -399,7 +459,7 @@
       </w:pPr>
       <w:r>
         <w:rPr>
-          <w:rFonts w:cs="Times New Roman" w:hint="eastAsia" w:ascii="Times New Roman" w:hAnsi="Times New Roman"/>
+          <w:rFonts w:ascii="Times New Roman" w:hAnsi="Times New Roman" w:cs="Times New Roman" w:hint="eastAsia"/>
           <w:b/>
           <w:bCs/>
         </w:rPr>
@@ -407,7 +467,7 @@
       </w:r>
       <w:r>
         <w:rPr>
-          <w:rFonts w:cs="Times New Roman" w:ascii="Times New Roman" w:hAnsi="Times New Roman"/>
+          <w:rFonts w:ascii="Times New Roman" w:hAnsi="Times New Roman" w:cs="Times New Roman"/>
           <w:b/>
           <w:bCs/>
         </w:rPr>
@@ -415,7 +475,7 @@
       </w:r>
       <w:r>
         <w:rPr>
-          <w:rFonts w:cs="Times New Roman" w:hint="eastAsia" w:ascii="Times New Roman" w:hAnsi="Times New Roman"/>
+          <w:rFonts w:ascii="Times New Roman" w:hAnsi="Times New Roman" w:cs="Times New Roman" w:hint="eastAsia"/>
           <w:b/>
           <w:bCs/>
         </w:rPr>
@@ -423,7 +483,7 @@
       </w:r>
       <w:r>
         <w:rPr>
-          <w:rFonts w:cs="Times New Roman" w:ascii="Times New Roman" w:hAnsi="Times New Roman"/>
+          <w:rFonts w:ascii="Times New Roman" w:hAnsi="Times New Roman" w:cs="Times New Roman"/>
           <w:b/>
           <w:bCs/>
         </w:rPr>
@@ -431,7 +491,7 @@
       </w:r>
       <w:r>
         <w:rPr>
-          <w:rFonts w:cs="Times New Roman" w:hint="eastAsia" w:ascii="Times New Roman" w:hAnsi="Times New Roman"/>
+          <w:rFonts w:ascii="Times New Roman" w:hAnsi="Times New Roman" w:cs="Times New Roman" w:hint="eastAsia"/>
           <w:b/>
           <w:bCs/>
         </w:rPr>
@@ -439,7 +499,7 @@
       </w:r>
       <w:r>
         <w:rPr>
-          <w:rFonts w:cs="Times New Roman" w:ascii="Times New Roman" w:hAnsi="Times New Roman"/>
+          <w:rFonts w:ascii="Times New Roman" w:hAnsi="Times New Roman" w:cs="Times New Roman"/>
           <w:b/>
           <w:bCs/>
         </w:rPr>
@@ -447,7 +507,7 @@
       </w:r>
       <w:r>
         <w:rPr>
-          <w:rFonts w:cs="Times New Roman" w:hint="eastAsia" w:ascii="Times New Roman" w:hAnsi="Times New Roman"/>
+          <w:rFonts w:ascii="Times New Roman" w:hAnsi="Times New Roman" w:cs="Times New Roman" w:hint="eastAsia"/>
           <w:b/>
           <w:bCs/>
         </w:rPr>
@@ -455,7 +515,7 @@
       </w:r>
       <w:r>
         <w:rPr>
-          <w:rFonts w:cs="Times New Roman" w:ascii="Times New Roman" w:hAnsi="Times New Roman"/>
+          <w:rFonts w:ascii="Times New Roman" w:hAnsi="Times New Roman" w:cs="Times New Roman"/>
           <w:b/>
           <w:bCs/>
         </w:rPr>
@@ -463,7 +523,7 @@
       </w:r>
       <w:r>
         <w:rPr>
-          <w:rFonts w:cs="Times New Roman" w:hint="eastAsia" w:ascii="Times New Roman" w:hAnsi="Times New Roman"/>
+          <w:rFonts w:ascii="Times New Roman" w:hAnsi="Times New Roman" w:cs="Times New Roman" w:hint="eastAsia"/>
           <w:b/>
           <w:bCs/>
         </w:rPr>
@@ -471,7 +531,7 @@
       </w:r>
       <w:r>
         <w:rPr>
-          <w:rFonts w:cs="Times New Roman" w:ascii="Times New Roman" w:hAnsi="Times New Roman"/>
+          <w:rFonts w:ascii="Times New Roman" w:hAnsi="Times New Roman" w:cs="Times New Roman"/>
           <w:b/>
           <w:bCs/>
         </w:rPr>
@@ -480,40 +540,38 @@
     </w:p>
     <w:p>
       <w:pPr>
-        <w:pStyle w:val="Normal"/>
         <w:rPr>
           <w:rFonts w:ascii="Times New Roman" w:hAnsi="Times New Roman" w:cs="Times New Roman"/>
         </w:rPr>
       </w:pPr>
       <w:r>
         <w:rPr>
-          <w:rFonts w:cs="Times New Roman" w:ascii="Times New Roman" w:hAnsi="Times New Roman"/>
+          <w:rFonts w:ascii="Times New Roman" w:hAnsi="Times New Roman" w:cs="Times New Roman"/>
         </w:rPr>
         <w:t xml:space="preserve">Mutation densities of </w:t>
       </w:r>
       <w:r>
         <w:rPr>
-          <w:rFonts w:cs="Times New Roman" w:hint="eastAsia" w:ascii="Times New Roman" w:hAnsi="Times New Roman"/>
+          <w:rFonts w:ascii="Times New Roman" w:hAnsi="Times New Roman" w:cs="Times New Roman" w:hint="eastAsia"/>
         </w:rPr>
         <w:t>83-type</w:t>
       </w:r>
       <w:r>
         <w:rPr>
-          <w:rFonts w:cs="Times New Roman" w:ascii="Times New Roman" w:hAnsi="Times New Roman"/>
+          <w:rFonts w:ascii="Times New Roman" w:hAnsi="Times New Roman" w:cs="Times New Roman"/>
         </w:rPr>
         <w:t xml:space="preserve"> signatures per decile (y axes) are presented for early (left) to late (right) replication domains. Real mutations for signatures are shown as bars, and simulated mutations are shown as red dashed lines. As the numbers shown on top of each plot, green bars indicate signatures consistently associated with late replication timing across cancer types; yellow bars indicate signatures consistently associated with early replication timing across cancer types; purple bars indicate signatures not affected by replication timing; blue bars indicate signatures showing inconsistent trend across cancer types.</w:t>
       </w:r>
     </w:p>
     <w:p>
       <w:pPr>
-        <w:pStyle w:val="Normal"/>
         <w:rPr>
           <w:rFonts w:ascii="Times New Roman" w:hAnsi="Times New Roman" w:cs="Times New Roman"/>
         </w:rPr>
       </w:pPr>
       <w:r>
         <w:rPr>
-          <w:rFonts w:cs="Times New Roman" w:ascii="Times New Roman" w:hAnsi="Times New Roman"/>
+          <w:rFonts w:ascii="Times New Roman" w:hAnsi="Times New Roman" w:cs="Times New Roman"/>
           <w:b/>
           <w:bCs/>
         </w:rPr>
@@ -521,52 +579,120 @@
       </w:r>
       <w:r>
         <w:rPr>
-          <w:rFonts w:cs="Times New Roman" w:ascii="Times New Roman" w:hAnsi="Times New Roman"/>
+          <w:rFonts w:ascii="Times New Roman" w:hAnsi="Times New Roman" w:cs="Times New Roman"/>
         </w:rPr>
         <w:t xml:space="preserve"> </w:t>
       </w:r>
     </w:p>
     <w:p>
       <w:pPr>
-        <w:pStyle w:val="Normal"/>
         <w:rPr>
           <w:rFonts w:ascii="Times New Roman" w:hAnsi="Times New Roman" w:cs="Times New Roman"/>
         </w:rPr>
       </w:pPr>
       <w:r>
         <w:rPr>
-          <w:rFonts w:cs="Times New Roman" w:ascii="Times New Roman" w:hAnsi="Times New Roman"/>
+          <w:rFonts w:ascii="Times New Roman" w:hAnsi="Times New Roman" w:cs="Times New Roman"/>
         </w:rPr>
         <w:t xml:space="preserve">From top to bottom, spectra are displayed in 83-type, 89-type, and partial 476-type representations (specifically highlighting </w:t>
       </w:r>
       <w:r>
         <w:rPr>
-          <w:rFonts w:cs="Times New Roman" w:hint="eastAsia" w:ascii="Times New Roman" w:hAnsi="Times New Roman"/>
+          <w:rFonts w:ascii="Times New Roman" w:hAnsi="Times New Roman" w:cs="Times New Roman" w:hint="eastAsia"/>
         </w:rPr>
         <w:t>≥</w:t>
       </w:r>
       <w:r>
         <w:rPr>
-          <w:rFonts w:cs="Times New Roman" w:ascii="Times New Roman" w:hAnsi="Times New Roman"/>
+          <w:rFonts w:ascii="Times New Roman" w:hAnsi="Times New Roman" w:cs="Times New Roman"/>
         </w:rPr>
         <w:t xml:space="preserve">2bp deletions, </w:t>
       </w:r>
       <w:r>
         <w:rPr>
-          <w:rFonts w:cs="Times New Roman" w:hint="eastAsia" w:ascii="Times New Roman" w:hAnsi="Times New Roman"/>
+          <w:rFonts w:ascii="Times New Roman" w:hAnsi="Times New Roman" w:cs="Times New Roman" w:hint="eastAsia"/>
         </w:rPr>
         <w:t>≥</w:t>
       </w:r>
       <w:r>
         <w:rPr>
-          <w:rFonts w:cs="Times New Roman" w:ascii="Times New Roman" w:hAnsi="Times New Roman"/>
-        </w:rPr>
-        <w:t>2bp insertions, and deletions with microhomology). Predominant peaks for ID_F/InsDel_F are evident in both RNase H2-deficient tumors and RPE1 clones, characterized by: Del:2bp:Repeats:2 and Del:2bp:MH:1 (83-type); L(2,8):U(1,2):R(2,4) and L(2,5):M1 (89-type); and Del2:U2:R2 and Del2:M1 (476-type). Notably, these features are nearly absent in wild-type RPE1 control clones.</w:t>
+          <w:rFonts w:ascii="Times New Roman" w:hAnsi="Times New Roman" w:cs="Times New Roman"/>
+        </w:rPr>
+        <w:t>2bp insertions, and deletions with microhomology). Predominant peaks for ID_F/InsDel_F are evident in both RNase H2-deficient tumors and RPE1 clones, characterized by: Del:2</w:t>
+      </w:r>
+      <w:proofErr w:type="gramStart"/>
+      <w:r>
+        <w:rPr>
+          <w:rFonts w:ascii="Times New Roman" w:hAnsi="Times New Roman" w:cs="Times New Roman"/>
+        </w:rPr>
+        <w:t>bp:Repeats</w:t>
+      </w:r>
+      <w:proofErr w:type="gramEnd"/>
+      <w:r>
+        <w:rPr>
+          <w:rFonts w:ascii="Times New Roman" w:hAnsi="Times New Roman" w:cs="Times New Roman"/>
+        </w:rPr>
+        <w:t>:2 and Del:2bp:MH:1 (83-type); L(2,8</w:t>
+      </w:r>
+      <w:proofErr w:type="gramStart"/>
+      <w:r>
+        <w:rPr>
+          <w:rFonts w:ascii="Times New Roman" w:hAnsi="Times New Roman" w:cs="Times New Roman"/>
+        </w:rPr>
+        <w:t>):U</w:t>
+      </w:r>
+      <w:proofErr w:type="gramEnd"/>
+      <w:r>
+        <w:rPr>
+          <w:rFonts w:ascii="Times New Roman" w:hAnsi="Times New Roman" w:cs="Times New Roman"/>
+        </w:rPr>
+        <w:t>(1,2</w:t>
+      </w:r>
+      <w:proofErr w:type="gramStart"/>
+      <w:r>
+        <w:rPr>
+          <w:rFonts w:ascii="Times New Roman" w:hAnsi="Times New Roman" w:cs="Times New Roman"/>
+        </w:rPr>
+        <w:t>):R</w:t>
+      </w:r>
+      <w:proofErr w:type="gramEnd"/>
+      <w:r>
+        <w:rPr>
+          <w:rFonts w:ascii="Times New Roman" w:hAnsi="Times New Roman" w:cs="Times New Roman"/>
+        </w:rPr>
+        <w:t xml:space="preserve">(2,4) and </w:t>
+      </w:r>
+      <w:proofErr w:type="gramStart"/>
+      <w:r>
+        <w:rPr>
+          <w:rFonts w:ascii="Times New Roman" w:hAnsi="Times New Roman" w:cs="Times New Roman"/>
+        </w:rPr>
+        <w:t>L(</w:t>
+      </w:r>
+      <w:proofErr w:type="gramEnd"/>
+      <w:r>
+        <w:rPr>
+          <w:rFonts w:ascii="Times New Roman" w:hAnsi="Times New Roman" w:cs="Times New Roman"/>
+        </w:rPr>
+        <w:t>2,5):M1 (89-type); and Del</w:t>
+      </w:r>
+      <w:proofErr w:type="gramStart"/>
+      <w:r>
+        <w:rPr>
+          <w:rFonts w:ascii="Times New Roman" w:hAnsi="Times New Roman" w:cs="Times New Roman"/>
+        </w:rPr>
+        <w:t>2:U2</w:t>
+      </w:r>
+      <w:proofErr w:type="gramEnd"/>
+      <w:r>
+        <w:rPr>
+          <w:rFonts w:ascii="Times New Roman" w:hAnsi="Times New Roman" w:cs="Times New Roman"/>
+        </w:rPr>
+        <w:t>:R2 and Del2:M1 (476-type). Notably, these features are nearly absent in wild-type RPE1 control clones.</w:t>
       </w:r>
     </w:p>
     <w:p>
       <w:pPr>
-        <w:pStyle w:val="Normal"/>
         <w:rPr>
           <w:rFonts w:ascii="Times New Roman" w:hAnsi="Times New Roman" w:cs="Times New Roman"/>
           <w:b/>
@@ -575,116 +701,144 @@
       </w:pPr>
       <w:r>
         <w:rPr>
-          <w:rFonts w:cs="Times New Roman" w:ascii="Times New Roman" w:hAnsi="Times New Roman"/>
-          <w:b/>
-          <w:bCs/>
-        </w:rPr>
-        <w:t>Figure S6. Demographic associations of indel signatures with sex and age.</w:t>
+          <w:rFonts w:ascii="Times New Roman" w:hAnsi="Times New Roman" w:cs="Times New Roman"/>
+          <w:b/>
+          <w:bCs/>
+        </w:rPr>
+        <w:t>Figure S6 Demographic associations of indel signatures with sex and age.</w:t>
       </w:r>
     </w:p>
     <w:p>
       <w:pPr>
-        <w:pStyle w:val="Normal"/>
         <w:rPr>
           <w:rFonts w:ascii="Times New Roman" w:hAnsi="Times New Roman" w:cs="Times New Roman"/>
         </w:rPr>
       </w:pPr>
       <w:r>
         <w:rPr>
-          <w:rFonts w:cs="Times New Roman" w:ascii="Times New Roman" w:hAnsi="Times New Roman"/>
+          <w:rFonts w:ascii="Times New Roman" w:hAnsi="Times New Roman" w:cs="Times New Roman"/>
         </w:rPr>
         <w:t xml:space="preserve">(A) Sex association of 83-type and 89-type indel signatures. Bar height represents the log₂ odds ratio (log₂OR), with positive values indicating enrichment in females (red) and negative values indicating enrichment in males (blue). Color shade indicates the significance level (−log₁₀FDR). Only signatures with FDR &lt; </w:t>
       </w:r>
       <w:r>
         <w:rPr>
-          <w:rFonts w:cs="Times New Roman" w:hint="eastAsia" w:ascii="Times New Roman" w:hAnsi="Times New Roman"/>
+          <w:rFonts w:ascii="Times New Roman" w:hAnsi="Times New Roman" w:cs="Times New Roman" w:hint="eastAsia"/>
         </w:rPr>
         <w:t>0.2</w:t>
       </w:r>
       <w:r>
         <w:rPr>
-          <w:rFonts w:cs="Times New Roman" w:ascii="Times New Roman" w:hAnsi="Times New Roman"/>
+          <w:rFonts w:ascii="Times New Roman" w:hAnsi="Times New Roman" w:cs="Times New Roman"/>
         </w:rPr>
         <w:t xml:space="preserve"> are shown.</w:t>
       </w:r>
     </w:p>
     <w:p>
-      <w:pPr>
-        <w:pStyle w:val="Normal"/>
+      <w:r>
+        <w:rPr>
+          <w:rFonts w:ascii="Times New Roman" w:hAnsi="Times New Roman" w:cs="Times New Roman"/>
+        </w:rPr>
+        <w:t xml:space="preserve">(B) Age association of 83-type and 89-type indel signatures across cancer types. Color shade indicates the Spearman correlation coefficient (ρ), and dot size corresponds to the significance level (−log₁₀FDR). Only signatures with FDR &lt; </w:t>
+      </w:r>
+      <w:r>
+        <w:rPr>
+          <w:rFonts w:ascii="Times New Roman" w:hAnsi="Times New Roman" w:cs="Times New Roman" w:hint="eastAsia"/>
+        </w:rPr>
+        <w:t xml:space="preserve">0.05 and </w:t>
+      </w:r>
+      <w:r>
+        <w:rPr>
+          <w:rFonts w:ascii="Times New Roman" w:hAnsi="Times New Roman" w:cs="Times New Roman"/>
+        </w:rPr>
+        <w:t>ρ</w:t>
+      </w:r>
+      <w:r>
+        <w:rPr>
+          <w:rFonts w:ascii="Times New Roman" w:hAnsi="Times New Roman" w:cs="Times New Roman" w:hint="eastAsia"/>
+        </w:rPr>
+        <w:t xml:space="preserve"> &gt; 0.1</w:t>
+      </w:r>
+      <w:r>
+        <w:rPr>
+          <w:rFonts w:ascii="Times New Roman" w:hAnsi="Times New Roman" w:cs="Times New Roman"/>
+        </w:rPr>
+        <w:t xml:space="preserve"> are shown.</w:t>
+      </w:r>
+      <w:r>
         <w:rPr>
           <w:rFonts w:hint="eastAsia"/>
         </w:rPr>
-      </w:pPr>
-      <w:r>
-        <w:rPr>
-          <w:rFonts w:cs="Times New Roman" w:ascii="Times New Roman" w:hAnsi="Times New Roman"/>
-        </w:rPr>
-        <w:t xml:space="preserve">(B) Age association of 83-type and 89-type indel signatures across cancer types. Color shade indicates the Spearman correlation coefficient (ρ), and dot size corresponds to the significance level (−log₁₀FDR). Only signatures with FDR &lt; </w:t>
-      </w:r>
-      <w:r>
-        <w:rPr>
-          <w:rFonts w:cs="Times New Roman" w:hint="eastAsia" w:ascii="Times New Roman" w:hAnsi="Times New Roman"/>
-        </w:rPr>
-        <w:t xml:space="preserve">0.05 and </w:t>
-      </w:r>
-      <w:r>
-        <w:rPr>
-          <w:rFonts w:cs="Times New Roman" w:ascii="Times New Roman" w:hAnsi="Times New Roman"/>
-        </w:rPr>
-        <w:t>ρ</w:t>
-      </w:r>
-      <w:r>
-        <w:rPr>
-          <w:rFonts w:cs="Times New Roman" w:hint="eastAsia" w:ascii="Times New Roman" w:hAnsi="Times New Roman"/>
-        </w:rPr>
-        <w:t xml:space="preserve"> &gt; 0.1</w:t>
-      </w:r>
-      <w:r>
-        <w:rPr>
-          <w:rFonts w:cs="Times New Roman" w:ascii="Times New Roman" w:hAnsi="Times New Roman"/>
-        </w:rPr>
-        <w:t xml:space="preserve"> are shown.</w:t>
-      </w:r>
-      <w:r>
-        <w:rPr>
-          <w:rFonts w:hint="eastAsia"/>
-        </w:rPr>
         <w:t xml:space="preserve">  </w:t>
       </w:r>
     </w:p>
-    <w:p>
-      <w:pPr>
-        <w:pStyle w:val="Normal"/>
-        <w:spacing w:before="0" w:after="160"/>
-        <w:rPr>
-          <w:rFonts w:hint="eastAsia"/>
-        </w:rPr>
-      </w:pPr>
-      <w:r>
-        <w:rPr>
-          <w:rFonts w:hint="eastAsia"/>
-        </w:rPr>
-      </w:r>
-    </w:p>
+    <w:p/>
     <w:sectPr>
-      <w:type w:val="nextPage"/>
       <w:pgSz w:w="11906" w:h="16838"/>
-      <w:pgMar w:left="1800" w:right="1800" w:gutter="0" w:header="0" w:top="1440" w:footer="0" w:bottom="1440"/>
-      <w:pgNumType w:fmt="decimal"/>
-      <w:formProt w:val="false"/>
-      <w:textDirection w:val="lrTb"/>
-      <w:docGrid w:type="lines" w:linePitch="312" w:charSpace="0"/>
+      <w:pgMar w:top="1440" w:right="1800" w:bottom="1440" w:left="1800" w:header="0" w:footer="0" w:gutter="0"/>
+      <w:cols w:space="720"/>
+      <w:formProt w:val="0"/>
+      <w:docGrid w:type="lines" w:linePitch="312"/>
     </w:sectPr>
   </w:body>
 </w:document>
 </file>
 
+<file path=word/endnotes.xml><?xml version="1.0" encoding="utf-8"?>
+<w:endnotes xmlns:wpc="http://schemas.microsoft.com/office/word/2010/wordprocessingCanvas" xmlns:cx="http://schemas.microsoft.com/office/drawing/2014/chartex" xmlns:cx1="http://schemas.microsoft.com/office/drawing/2015/9/8/chartex" xmlns:cx2="http://schemas.microsoft.com/office/drawing/2015/10/21/chartex" xmlns:cx3="http://schemas.microsoft.com/office/drawing/2016/5/9/chartex" xmlns:cx4="http://schemas.microsoft.com/office/drawing/2016/5/10/chartex" xmlns:cx5="http://schemas.microsoft.com/office/drawing/2016/5/11/chartex" xmlns:cx6="http://schemas.microsoft.com/office/drawing/2016/5/12/chartex" xmlns:cx7="http://schemas.microsoft.com/office/drawing/2016/5/13/chartex" xmlns:cx8="http://schemas.microsoft.com/office/drawing/2016/5/14/chartex" xmlns:mc="http://schemas.openxmlformats.org/markup-compatibility/2006" xmlns:aink="http://schemas.microsoft.com/office/drawing/2016/ink" xmlns:am3d="http://schemas.microsoft.com/office/drawing/2017/model3d" xmlns:o="urn:schemas-microsoft-com:office:office" xmlns:oel="http://schemas.microsoft.com/office/2019/extlst" xmlns:r="http://schemas.openxmlformats.org/officeDocument/2006/relationships" xmlns:m="http://schemas.openxmlformats.org/officeDocument/2006/math" xmlns:v="urn:schemas-microsoft-com:vml" xmlns:wp14="http://schemas.microsoft.com/office/word/2010/wordprocessingDrawing" xmlns:wp="http://schemas.openxmlformats.org/drawingml/2006/wordprocessingDrawing" xmlns:w10="urn:schemas-microsoft-com:office:word" xmlns:w="http://schemas.openxmlformats.org/wordprocessingml/2006/main" xmlns:w14="http://schemas.microsoft.com/office/word/2010/wordml" xmlns:w15="http://schemas.microsoft.com/office/word/2012/wordml" xmlns:w16cex="http://schemas.microsoft.com/office/word/2018/wordml/cex" xmlns:w16cid="http://schemas.microsoft.com/office/word/2016/wordml/cid" xmlns:w16="http://schemas.microsoft.com/office/word/2018/wordml" xmlns:w16du="http://schemas.microsoft.com/office/word/2023/wordml/word16du" xmlns:w16sdtdh="http://schemas.microsoft.com/office/word/2020/wordml/sdtdatahash" xmlns:w16sdtfl="http://schemas.microsoft.com/office/word/2024/wordml/sdtformatlock" xmlns:w16se="http://schemas.microsoft.com/office/word/2015/wordml/symex" xmlns:wpg="http://schemas.microsoft.com/office/word/2010/wordprocessingGroup" xmlns:wpi="http://schemas.microsoft.com/office/word/2010/wordprocessingInk" xmlns:wne="http://schemas.microsoft.com/office/word/2006/wordml" xmlns:wps="http://schemas.microsoft.com/office/word/2010/wordprocessingShape" mc:Ignorable="w14 w15 w16se w16cid w16 w16cex w16sdtdh w16sdtfl w16du wp14">
+  <w:endnote w:type="separator" w:id="-1">
+    <w:p>
+      <w:pPr>
+        <w:spacing w:after="0" w:line="240" w:lineRule="auto"/>
+      </w:pPr>
+      <w:r>
+        <w:separator/>
+      </w:r>
+    </w:p>
+  </w:endnote>
+  <w:endnote w:type="continuationSeparator" w:id="0">
+    <w:p>
+      <w:pPr>
+        <w:spacing w:after="0" w:line="240" w:lineRule="auto"/>
+      </w:pPr>
+      <w:r>
+        <w:continuationSeparator/>
+      </w:r>
+    </w:p>
+  </w:endnote>
+</w:endnotes>
+</file>
+
+<file path=word/footnotes.xml><?xml version="1.0" encoding="utf-8"?>
+<w:footnotes xmlns:wpc="http://schemas.microsoft.com/office/word/2010/wordprocessingCanvas" xmlns:cx="http://schemas.microsoft.com/office/drawing/2014/chartex" xmlns:cx1="http://schemas.microsoft.com/office/drawing/2015/9/8/chartex" xmlns:cx2="http://schemas.microsoft.com/office/drawing/2015/10/21/chartex" xmlns:cx3="http://schemas.microsoft.com/office/drawing/2016/5/9/chartex" xmlns:cx4="http://schemas.microsoft.com/office/drawing/2016/5/10/chartex" xmlns:cx5="http://schemas.microsoft.com/office/drawing/2016/5/11/chartex" xmlns:cx6="http://schemas.microsoft.com/office/drawing/2016/5/12/chartex" xmlns:cx7="http://schemas.microsoft.com/office/drawing/2016/5/13/chartex" xmlns:cx8="http://schemas.microsoft.com/office/drawing/2016/5/14/chartex" xmlns:mc="http://schemas.openxmlformats.org/markup-compatibility/2006" xmlns:aink="http://schemas.microsoft.com/office/drawing/2016/ink" xmlns:am3d="http://schemas.microsoft.com/office/drawing/2017/model3d" xmlns:o="urn:schemas-microsoft-com:office:office" xmlns:oel="http://schemas.microsoft.com/office/2019/extlst" xmlns:r="http://schemas.openxmlformats.org/officeDocument/2006/relationships" xmlns:m="http://schemas.openxmlformats.org/officeDocument/2006/math" xmlns:v="urn:schemas-microsoft-com:vml" xmlns:wp14="http://schemas.microsoft.com/office/word/2010/wordprocessingDrawing" xmlns:wp="http://schemas.openxmlformats.org/drawingml/2006/wordprocessingDrawing" xmlns:w10="urn:schemas-microsoft-com:office:word" xmlns:w="http://schemas.openxmlformats.org/wordprocessingml/2006/main" xmlns:w14="http://schemas.microsoft.com/office/word/2010/wordml" xmlns:w15="http://schemas.microsoft.com/office/word/2012/wordml" xmlns:w16cex="http://schemas.microsoft.com/office/word/2018/wordml/cex" xmlns:w16cid="http://schemas.microsoft.com/office/word/2016/wordml/cid" xmlns:w16="http://schemas.microsoft.com/office/word/2018/wordml" xmlns:w16du="http://schemas.microsoft.com/office/word/2023/wordml/word16du" xmlns:w16sdtdh="http://schemas.microsoft.com/office/word/2020/wordml/sdtdatahash" xmlns:w16sdtfl="http://schemas.microsoft.com/office/word/2024/wordml/sdtformatlock" xmlns:w16se="http://schemas.microsoft.com/office/word/2015/wordml/symex" xmlns:wpg="http://schemas.microsoft.com/office/word/2010/wordprocessingGroup" xmlns:wpi="http://schemas.microsoft.com/office/word/2010/wordprocessingInk" xmlns:wne="http://schemas.microsoft.com/office/word/2006/wordml" xmlns:wps="http://schemas.microsoft.com/office/word/2010/wordprocessingShape" mc:Ignorable="w14 w15 w16se w16cid w16 w16cex w16sdtdh w16sdtfl w16du wp14">
+  <w:footnote w:type="separator" w:id="-1">
+    <w:p>
+      <w:pPr>
+        <w:spacing w:after="0" w:line="240" w:lineRule="auto"/>
+      </w:pPr>
+      <w:r>
+        <w:separator/>
+      </w:r>
+    </w:p>
+  </w:footnote>
+  <w:footnote w:type="continuationSeparator" w:id="0">
+    <w:p>
+      <w:pPr>
+        <w:spacing w:after="0" w:line="240" w:lineRule="auto"/>
+      </w:pPr>
+      <w:r>
+        <w:continuationSeparator/>
+      </w:r>
+    </w:p>
+  </w:footnote>
+</w:footnotes>
+</file>
+
 <file path=word/styles.xml><?xml version="1.0" encoding="utf-8"?>
-<w:styles xmlns:w="http://schemas.openxmlformats.org/wordprocessingml/2006/main" xmlns:w14="http://schemas.microsoft.com/office/word/2010/wordml" xmlns:mc="http://schemas.openxmlformats.org/markup-compatibility/2006" mc:Ignorable="w14">
+<w:styles xmlns:mc="http://schemas.openxmlformats.org/markup-compatibility/2006" xmlns:r="http://schemas.openxmlformats.org/officeDocument/2006/relationships" xmlns:w="http://schemas.openxmlformats.org/wordprocessingml/2006/main" xmlns:w14="http://schemas.microsoft.com/office/word/2010/wordml" xmlns:w15="http://schemas.microsoft.com/office/word/2012/wordml" xmlns:w16cex="http://schemas.microsoft.com/office/word/2018/wordml/cex" xmlns:w16cid="http://schemas.microsoft.com/office/word/2016/wordml/cid" xmlns:w16="http://schemas.microsoft.com/office/word/2018/wordml" xmlns:w16du="http://schemas.microsoft.com/office/word/2023/wordml/word16du" xmlns:w16sdtdh="http://schemas.microsoft.com/office/word/2020/wordml/sdtdatahash" xmlns:w16sdtfl="http://schemas.microsoft.com/office/word/2024/wordml/sdtformatlock" xmlns:w16se="http://schemas.microsoft.com/office/word/2015/wordml/symex" mc:Ignorable="w14 w15 w16se w16cid w16 w16cex w16sdtdh w16sdtfl w16du">
   <w:docDefaults>
     <w:rPrDefault>
       <w:rPr>
-        <w:rFonts w:ascii="等线" w:hAnsi="等线" w:eastAsia="等线" w:cs="" w:asciiTheme="minorHAnsi" w:cstheme="minorBidi" w:eastAsiaTheme="minorEastAsia" w:hAnsiTheme="minorHAnsi"/>
+        <w:rFonts w:asciiTheme="minorHAnsi" w:eastAsiaTheme="minorEastAsia" w:hAnsiTheme="minorHAnsi" w:cstheme="minorBidi"/>
         <w:kern w:val="2"/>
         <w:sz w:val="22"/>
         <w:szCs w:val="24"/>
@@ -694,21 +848,21 @@
     </w:rPrDefault>
     <w:pPrDefault>
       <w:pPr>
-        <w:suppressAutoHyphens w:val="true"/>
+        <w:suppressAutoHyphens/>
       </w:pPr>
     </w:pPrDefault>
   </w:docDefaults>
   <w:latentStyles w:defLockedState="0" w:defUIPriority="99" w:defSemiHidden="0" w:defUnhideWhenUsed="0" w:defQFormat="0" w:count="376">
     <w:lsdException w:name="Normal" w:uiPriority="0" w:qFormat="1"/>
     <w:lsdException w:name="heading 1" w:uiPriority="9" w:qFormat="1"/>
-    <w:lsdException w:name="heading 2" w:uiPriority="9" w:semiHidden="1" w:unhideWhenUsed="1" w:qFormat="1"/>
-    <w:lsdException w:name="heading 3" w:uiPriority="9" w:semiHidden="1" w:unhideWhenUsed="1" w:qFormat="1"/>
-    <w:lsdException w:name="heading 4" w:uiPriority="9" w:semiHidden="1" w:unhideWhenUsed="1" w:qFormat="1"/>
-    <w:lsdException w:name="heading 5" w:uiPriority="9" w:semiHidden="1" w:unhideWhenUsed="1" w:qFormat="1"/>
-    <w:lsdException w:name="heading 6" w:uiPriority="9" w:semiHidden="1" w:unhideWhenUsed="1" w:qFormat="1"/>
-    <w:lsdException w:name="heading 7" w:uiPriority="9" w:semiHidden="1" w:unhideWhenUsed="1" w:qFormat="1"/>
-    <w:lsdException w:name="heading 8" w:uiPriority="9" w:semiHidden="1" w:unhideWhenUsed="1" w:qFormat="1"/>
-    <w:lsdException w:name="heading 9" w:uiPriority="9" w:semiHidden="1" w:unhideWhenUsed="1" w:qFormat="1"/>
+    <w:lsdException w:name="heading 2" w:semiHidden="1" w:uiPriority="9" w:unhideWhenUsed="1" w:qFormat="1"/>
+    <w:lsdException w:name="heading 3" w:semiHidden="1" w:uiPriority="9" w:unhideWhenUsed="1" w:qFormat="1"/>
+    <w:lsdException w:name="heading 4" w:semiHidden="1" w:uiPriority="9" w:unhideWhenUsed="1" w:qFormat="1"/>
+    <w:lsdException w:name="heading 5" w:semiHidden="1" w:uiPriority="9" w:unhideWhenUsed="1" w:qFormat="1"/>
+    <w:lsdException w:name="heading 6" w:semiHidden="1" w:uiPriority="9" w:unhideWhenUsed="1" w:qFormat="1"/>
+    <w:lsdException w:name="heading 7" w:semiHidden="1" w:uiPriority="9" w:unhideWhenUsed="1" w:qFormat="1"/>
+    <w:lsdException w:name="heading 8" w:semiHidden="1" w:uiPriority="9" w:unhideWhenUsed="1" w:qFormat="1"/>
+    <w:lsdException w:name="heading 9" w:semiHidden="1" w:uiPriority="9" w:unhideWhenUsed="1" w:qFormat="1"/>
     <w:lsdException w:name="index 1" w:semiHidden="1" w:unhideWhenUsed="1"/>
     <w:lsdException w:name="index 2" w:semiHidden="1" w:unhideWhenUsed="1"/>
     <w:lsdException w:name="index 3" w:semiHidden="1" w:unhideWhenUsed="1"/>
@@ -718,22 +872,22 @@
     <w:lsdException w:name="index 7" w:semiHidden="1" w:unhideWhenUsed="1"/>
     <w:lsdException w:name="index 8" w:semiHidden="1" w:unhideWhenUsed="1"/>
     <w:lsdException w:name="index 9" w:semiHidden="1" w:unhideWhenUsed="1"/>
-    <w:lsdException w:name="toc 1" w:uiPriority="39" w:semiHidden="1" w:unhideWhenUsed="1"/>
-    <w:lsdException w:name="toc 2" w:uiPriority="39" w:semiHidden="1" w:unhideWhenUsed="1"/>
-    <w:lsdException w:name="toc 3" w:uiPriority="39" w:semiHidden="1" w:unhideWhenUsed="1"/>
-    <w:lsdException w:name="toc 4" w:uiPriority="39" w:semiHidden="1" w:unhideWhenUsed="1"/>
-    <w:lsdException w:name="toc 5" w:uiPriority="39" w:semiHidden="1" w:unhideWhenUsed="1"/>
-    <w:lsdException w:name="toc 6" w:uiPriority="39" w:semiHidden="1" w:unhideWhenUsed="1"/>
-    <w:lsdException w:name="toc 7" w:uiPriority="39" w:semiHidden="1" w:unhideWhenUsed="1"/>
-    <w:lsdException w:name="toc 8" w:uiPriority="39" w:semiHidden="1" w:unhideWhenUsed="1"/>
-    <w:lsdException w:name="toc 9" w:uiPriority="39" w:semiHidden="1" w:unhideWhenUsed="1"/>
+    <w:lsdException w:name="toc 1" w:semiHidden="1" w:uiPriority="39" w:unhideWhenUsed="1"/>
+    <w:lsdException w:name="toc 2" w:semiHidden="1" w:uiPriority="39" w:unhideWhenUsed="1"/>
+    <w:lsdException w:name="toc 3" w:semiHidden="1" w:uiPriority="39" w:unhideWhenUsed="1"/>
+    <w:lsdException w:name="toc 4" w:semiHidden="1" w:uiPriority="39" w:unhideWhenUsed="1"/>
+    <w:lsdException w:name="toc 5" w:semiHidden="1" w:uiPriority="39" w:unhideWhenUsed="1"/>
+    <w:lsdException w:name="toc 6" w:semiHidden="1" w:uiPriority="39" w:unhideWhenUsed="1"/>
+    <w:lsdException w:name="toc 7" w:semiHidden="1" w:uiPriority="39" w:unhideWhenUsed="1"/>
+    <w:lsdException w:name="toc 8" w:semiHidden="1" w:uiPriority="39" w:unhideWhenUsed="1"/>
+    <w:lsdException w:name="toc 9" w:semiHidden="1" w:uiPriority="39" w:unhideWhenUsed="1"/>
     <w:lsdException w:name="Normal Indent" w:semiHidden="1" w:unhideWhenUsed="1"/>
     <w:lsdException w:name="footnote text" w:semiHidden="1" w:unhideWhenUsed="1"/>
     <w:lsdException w:name="annotation text" w:semiHidden="1" w:unhideWhenUsed="1"/>
     <w:lsdException w:name="header" w:semiHidden="1" w:unhideWhenUsed="1"/>
     <w:lsdException w:name="footer" w:semiHidden="1" w:unhideWhenUsed="1"/>
     <w:lsdException w:name="index heading" w:semiHidden="1" w:unhideWhenUsed="1"/>
-    <w:lsdException w:name="caption" w:uiPriority="35" w:semiHidden="1" w:unhideWhenUsed="1" w:qFormat="1"/>
+    <w:lsdException w:name="caption" w:semiHidden="1" w:uiPriority="35" w:unhideWhenUsed="1" w:qFormat="1"/>
     <w:lsdException w:name="table of figures" w:semiHidden="1" w:unhideWhenUsed="1"/>
     <w:lsdException w:name="envelope address" w:semiHidden="1" w:unhideWhenUsed="1"/>
     <w:lsdException w:name="envelope return" w:semiHidden="1" w:unhideWhenUsed="1"/>
@@ -764,7 +918,7 @@
     <w:lsdException w:name="Title" w:uiPriority="10" w:qFormat="1"/>
     <w:lsdException w:name="Closing" w:semiHidden="1" w:unhideWhenUsed="1"/>
     <w:lsdException w:name="Signature" w:semiHidden="1" w:unhideWhenUsed="1"/>
-    <w:lsdException w:name="Default Paragraph Font" w:uiPriority="1" w:semiHidden="1" w:unhideWhenUsed="1"/>
+    <w:lsdException w:name="Default Paragraph Font" w:semiHidden="1" w:uiPriority="1" w:unhideWhenUsed="1"/>
     <w:lsdException w:name="Body Text" w:semiHidden="1" w:unhideWhenUsed="1"/>
     <w:lsdException w:name="Body Text Indent" w:semiHidden="1" w:unhideWhenUsed="1"/>
     <w:lsdException w:name="List Continue" w:semiHidden="1" w:unhideWhenUsed="1"/>
@@ -964,8 +1118,8 @@
     <w:lsdException w:name="Subtle Reference" w:uiPriority="31" w:qFormat="1"/>
     <w:lsdException w:name="Intense Reference" w:uiPriority="32" w:qFormat="1"/>
     <w:lsdException w:name="Book Title" w:uiPriority="33" w:qFormat="1"/>
-    <w:lsdException w:name="Bibliography" w:uiPriority="37" w:semiHidden="1" w:unhideWhenUsed="1"/>
-    <w:lsdException w:name="TOC Heading" w:uiPriority="39" w:semiHidden="1" w:unhideWhenUsed="1" w:qFormat="1"/>
+    <w:lsdException w:name="Bibliography" w:semiHidden="1" w:uiPriority="37" w:unhideWhenUsed="1"/>
+    <w:lsdException w:name="TOC Heading" w:semiHidden="1" w:uiPriority="39" w:unhideWhenUsed="1" w:qFormat="1"/>
     <w:lsdException w:name="Plain Table 1" w:uiPriority="41"/>
     <w:lsdException w:name="Plain Table 2" w:uiPriority="42"/>
     <w:lsdException w:name="Plain Table 3" w:uiPriority="43"/>
@@ -1076,24 +1230,13 @@
     <w:lsdException w:name="Unresolved Mention" w:semiHidden="1" w:unhideWhenUsed="1"/>
     <w:lsdException w:name="Smart Link" w:semiHidden="1" w:unhideWhenUsed="1"/>
   </w:latentStyles>
-  <w:style w:type="paragraph" w:styleId="Normal" w:default="1">
+  <w:style w:type="paragraph" w:default="1" w:styleId="Normal">
     <w:name w:val="Normal"/>
     <w:qFormat/>
     <w:pPr>
-      <w:widowControl w:val="false"/>
-      <w:bidi w:val="0"/>
-      <w:spacing w:lineRule="auto" w:line="278" w:before="0" w:after="160"/>
-      <w:jc w:val="start"/>
+      <w:widowControl w:val="0"/>
+      <w:spacing w:after="160" w:line="278" w:lineRule="auto"/>
     </w:pPr>
-    <w:rPr>
-      <w:rFonts w:ascii="等线" w:hAnsi="等线" w:eastAsia="等线" w:cs="" w:asciiTheme="minorHAnsi" w:cstheme="minorBidi" w:eastAsiaTheme="minorEastAsia" w:hAnsiTheme="minorHAnsi"/>
-      <w:color w:val="auto"/>
-      <w:kern w:val="2"/>
-      <w:sz w:val="22"/>
-      <w:szCs w:val="24"/>
-      <w:lang w:val="en-US" w:eastAsia="zh-CN" w:bidi="ar-SA"/>
-      <w14:ligatures w14:val="standardContextual"/>
-    </w:rPr>
   </w:style>
   <w:style w:type="paragraph" w:styleId="Heading1">
     <w:name w:val="heading 1"/>
@@ -1102,16 +1245,16 @@
     <w:link w:val="Heading1Char"/>
     <w:uiPriority w:val="9"/>
     <w:qFormat/>
-    <w:rsid w:val="004326a8"/>
+    <w:rsid w:val="004326A8"/>
     <w:pPr>
-      <w:keepNext w:val="true"/>
+      <w:keepNext/>
       <w:keepLines/>
       <w:spacing w:before="480" w:after="80"/>
       <w:outlineLvl w:val="0"/>
     </w:pPr>
     <w:rPr>
-      <w:rFonts w:ascii="等线 Light" w:hAnsi="等线 Light" w:eastAsia="等线 Light" w:cs="" w:asciiTheme="majorHAnsi" w:cstheme="majorBidi" w:eastAsiaTheme="majorEastAsia" w:hAnsiTheme="majorHAnsi"/>
-      <w:color w:themeColor="accent1" w:themeShade="bf" w:val="0F4761"/>
+      <w:rFonts w:asciiTheme="majorHAnsi" w:eastAsiaTheme="majorEastAsia" w:hAnsiTheme="majorHAnsi" w:cstheme="majorBidi"/>
+      <w:color w:val="0F4761" w:themeColor="accent1" w:themeShade="BF"/>
       <w:sz w:val="48"/>
       <w:szCs w:val="48"/>
     </w:rPr>
@@ -1125,16 +1268,16 @@
     <w:semiHidden/>
     <w:unhideWhenUsed/>
     <w:qFormat/>
-    <w:rsid w:val="004326a8"/>
+    <w:rsid w:val="004326A8"/>
     <w:pPr>
-      <w:keepNext w:val="true"/>
+      <w:keepNext/>
       <w:keepLines/>
       <w:spacing w:before="160" w:after="80"/>
       <w:outlineLvl w:val="1"/>
     </w:pPr>
     <w:rPr>
-      <w:rFonts w:ascii="等线 Light" w:hAnsi="等线 Light" w:eastAsia="等线 Light" w:cs="" w:asciiTheme="majorHAnsi" w:cstheme="majorBidi" w:eastAsiaTheme="majorEastAsia" w:hAnsiTheme="majorHAnsi"/>
-      <w:color w:themeColor="accent1" w:themeShade="bf" w:val="0F4761"/>
+      <w:rFonts w:asciiTheme="majorHAnsi" w:eastAsiaTheme="majorEastAsia" w:hAnsiTheme="majorHAnsi" w:cstheme="majorBidi"/>
+      <w:color w:val="0F4761" w:themeColor="accent1" w:themeShade="BF"/>
       <w:sz w:val="40"/>
       <w:szCs w:val="40"/>
     </w:rPr>
@@ -1148,16 +1291,16 @@
     <w:semiHidden/>
     <w:unhideWhenUsed/>
     <w:qFormat/>
-    <w:rsid w:val="004326a8"/>
+    <w:rsid w:val="004326A8"/>
     <w:pPr>
-      <w:keepNext w:val="true"/>
+      <w:keepNext/>
       <w:keepLines/>
       <w:spacing w:before="160" w:after="80"/>
       <w:outlineLvl w:val="2"/>
     </w:pPr>
     <w:rPr>
-      <w:rFonts w:ascii="等线 Light" w:hAnsi="等线 Light" w:eastAsia="等线 Light" w:cs="" w:asciiTheme="majorHAnsi" w:cstheme="majorBidi" w:eastAsiaTheme="majorEastAsia" w:hAnsiTheme="majorHAnsi"/>
-      <w:color w:themeColor="accent1" w:themeShade="bf" w:val="0F4761"/>
+      <w:rFonts w:asciiTheme="majorHAnsi" w:eastAsiaTheme="majorEastAsia" w:hAnsiTheme="majorHAnsi" w:cstheme="majorBidi"/>
+      <w:color w:val="0F4761" w:themeColor="accent1" w:themeShade="BF"/>
       <w:sz w:val="32"/>
       <w:szCs w:val="32"/>
     </w:rPr>
@@ -1171,16 +1314,16 @@
     <w:semiHidden/>
     <w:unhideWhenUsed/>
     <w:qFormat/>
-    <w:rsid w:val="004326a8"/>
+    <w:rsid w:val="004326A8"/>
     <w:pPr>
-      <w:keepNext w:val="true"/>
+      <w:keepNext/>
       <w:keepLines/>
       <w:spacing w:before="80" w:after="40"/>
       <w:outlineLvl w:val="3"/>
     </w:pPr>
     <w:rPr>
-      <w:rFonts w:cs="" w:cstheme="majorBidi"/>
-      <w:color w:themeColor="accent1" w:themeShade="bf" w:val="0F4761"/>
+      <w:rFonts w:cstheme="majorBidi"/>
+      <w:color w:val="0F4761" w:themeColor="accent1" w:themeShade="BF"/>
       <w:sz w:val="28"/>
       <w:szCs w:val="28"/>
     </w:rPr>
@@ -1194,16 +1337,16 @@
     <w:semiHidden/>
     <w:unhideWhenUsed/>
     <w:qFormat/>
-    <w:rsid w:val="004326a8"/>
+    <w:rsid w:val="004326A8"/>
     <w:pPr>
-      <w:keepNext w:val="true"/>
+      <w:keepNext/>
       <w:keepLines/>
       <w:spacing w:before="80" w:after="40"/>
       <w:outlineLvl w:val="4"/>
     </w:pPr>
     <w:rPr>
-      <w:rFonts w:cs="" w:cstheme="majorBidi"/>
-      <w:color w:themeColor="accent1" w:themeShade="bf" w:val="0F4761"/>
+      <w:rFonts w:cstheme="majorBidi"/>
+      <w:color w:val="0F4761" w:themeColor="accent1" w:themeShade="BF"/>
       <w:sz w:val="24"/>
     </w:rPr>
   </w:style>
@@ -1216,18 +1359,18 @@
     <w:semiHidden/>
     <w:unhideWhenUsed/>
     <w:qFormat/>
-    <w:rsid w:val="004326a8"/>
+    <w:rsid w:val="004326A8"/>
     <w:pPr>
-      <w:keepNext w:val="true"/>
+      <w:keepNext/>
       <w:keepLines/>
       <w:spacing w:before="40" w:after="0"/>
       <w:outlineLvl w:val="5"/>
     </w:pPr>
     <w:rPr>
-      <w:rFonts w:cs="" w:cstheme="majorBidi"/>
+      <w:rFonts w:cstheme="majorBidi"/>
       <w:b/>
       <w:bCs/>
-      <w:color w:themeColor="accent1" w:themeShade="bf" w:val="0F4761"/>
+      <w:color w:val="0F4761" w:themeColor="accent1" w:themeShade="BF"/>
     </w:rPr>
   </w:style>
   <w:style w:type="paragraph" w:styleId="Heading7">
@@ -1239,18 +1382,18 @@
     <w:semiHidden/>
     <w:unhideWhenUsed/>
     <w:qFormat/>
-    <w:rsid w:val="004326a8"/>
+    <w:rsid w:val="004326A8"/>
     <w:pPr>
-      <w:keepNext w:val="true"/>
+      <w:keepNext/>
       <w:keepLines/>
       <w:spacing w:before="40" w:after="0"/>
       <w:outlineLvl w:val="6"/>
     </w:pPr>
     <w:rPr>
-      <w:rFonts w:cs="" w:cstheme="majorBidi"/>
+      <w:rFonts w:cstheme="majorBidi"/>
       <w:b/>
       <w:bCs/>
-      <w:color w:themeColor="text1" w:themeTint="a6" w:val="595959"/>
+      <w:color w:val="595959" w:themeColor="text1" w:themeTint="A6"/>
     </w:rPr>
   </w:style>
   <w:style w:type="paragraph" w:styleId="Heading8">
@@ -1262,16 +1405,16 @@
     <w:semiHidden/>
     <w:unhideWhenUsed/>
     <w:qFormat/>
-    <w:rsid w:val="004326a8"/>
+    <w:rsid w:val="004326A8"/>
     <w:pPr>
-      <w:keepNext w:val="true"/>
+      <w:keepNext/>
       <w:keepLines/>
-      <w:spacing w:before="0" w:after="0"/>
+      <w:spacing w:after="0"/>
       <w:outlineLvl w:val="7"/>
     </w:pPr>
     <w:rPr>
-      <w:rFonts w:cs="" w:cstheme="majorBidi"/>
-      <w:color w:themeColor="text1" w:themeTint="a6" w:val="595959"/>
+      <w:rFonts w:cstheme="majorBidi"/>
+      <w:color w:val="595959" w:themeColor="text1" w:themeTint="A6"/>
     </w:rPr>
   </w:style>
   <w:style w:type="paragraph" w:styleId="Heading9">
@@ -1283,196 +1426,215 @@
     <w:semiHidden/>
     <w:unhideWhenUsed/>
     <w:qFormat/>
-    <w:rsid w:val="004326a8"/>
+    <w:rsid w:val="004326A8"/>
     <w:pPr>
-      <w:keepNext w:val="true"/>
+      <w:keepNext/>
       <w:keepLines/>
-      <w:spacing w:before="0" w:after="0"/>
+      <w:spacing w:after="0"/>
       <w:outlineLvl w:val="8"/>
     </w:pPr>
     <w:rPr>
-      <w:rFonts w:eastAsia="等线 Light" w:cs="" w:cstheme="majorBidi" w:eastAsiaTheme="majorEastAsia"/>
-      <w:color w:themeColor="text1" w:themeTint="a6" w:val="595959"/>
-    </w:rPr>
-  </w:style>
-  <w:style w:type="character" w:styleId="DefaultParagraphFont" w:default="1">
+      <w:rFonts w:eastAsiaTheme="majorEastAsia" w:cstheme="majorBidi"/>
+      <w:color w:val="595959" w:themeColor="text1" w:themeTint="A6"/>
+    </w:rPr>
+  </w:style>
+  <w:style w:type="character" w:default="1" w:styleId="DefaultParagraphFont">
     <w:name w:val="Default Paragraph Font"/>
     <w:uiPriority w:val="1"/>
     <w:semiHidden/>
     <w:unhideWhenUsed/>
-    <w:qFormat/>
-    <w:rPr/>
-  </w:style>
-  <w:style w:type="character" w:styleId="Heading1Char" w:customStyle="1">
+  </w:style>
+  <w:style w:type="table" w:default="1" w:styleId="TableNormal">
+    <w:name w:val="Normal Table"/>
+    <w:uiPriority w:val="99"/>
+    <w:semiHidden/>
+    <w:unhideWhenUsed/>
+    <w:tblPr>
+      <w:tblInd w:w="0" w:type="dxa"/>
+      <w:tblCellMar>
+        <w:top w:w="0" w:type="dxa"/>
+        <w:left w:w="108" w:type="dxa"/>
+        <w:bottom w:w="0" w:type="dxa"/>
+        <w:right w:w="108" w:type="dxa"/>
+      </w:tblCellMar>
+    </w:tblPr>
+  </w:style>
+  <w:style w:type="numbering" w:default="1" w:styleId="NoList">
+    <w:name w:val="No List"/>
+    <w:uiPriority w:val="99"/>
+    <w:semiHidden/>
+    <w:unhideWhenUsed/>
+  </w:style>
+  <w:style w:type="character" w:customStyle="1" w:styleId="Heading1Char">
     <w:name w:val="Heading 1 Char"/>
     <w:basedOn w:val="DefaultParagraphFont"/>
     <w:link w:val="Heading1"/>
     <w:uiPriority w:val="9"/>
     <w:qFormat/>
-    <w:rsid w:val="004326a8"/>
-    <w:rPr>
-      <w:rFonts w:ascii="等线 Light" w:hAnsi="等线 Light" w:eastAsia="等线 Light" w:cs="" w:asciiTheme="majorHAnsi" w:cstheme="majorBidi" w:eastAsiaTheme="majorEastAsia" w:hAnsiTheme="majorHAnsi"/>
-      <w:color w:themeColor="accent1" w:themeShade="bf" w:val="0F4761"/>
+    <w:rsid w:val="004326A8"/>
+    <w:rPr>
+      <w:rFonts w:asciiTheme="majorHAnsi" w:eastAsiaTheme="majorEastAsia" w:hAnsiTheme="majorHAnsi" w:cstheme="majorBidi"/>
+      <w:color w:val="0F4761" w:themeColor="accent1" w:themeShade="BF"/>
       <w:sz w:val="48"/>
       <w:szCs w:val="48"/>
     </w:rPr>
   </w:style>
-  <w:style w:type="character" w:styleId="Heading2Char" w:customStyle="1">
+  <w:style w:type="character" w:customStyle="1" w:styleId="Heading2Char">
     <w:name w:val="Heading 2 Char"/>
     <w:basedOn w:val="DefaultParagraphFont"/>
     <w:link w:val="Heading2"/>
     <w:uiPriority w:val="9"/>
     <w:semiHidden/>
     <w:qFormat/>
-    <w:rsid w:val="004326a8"/>
-    <w:rPr>
-      <w:rFonts w:ascii="等线 Light" w:hAnsi="等线 Light" w:eastAsia="等线 Light" w:cs="" w:asciiTheme="majorHAnsi" w:cstheme="majorBidi" w:eastAsiaTheme="majorEastAsia" w:hAnsiTheme="majorHAnsi"/>
-      <w:color w:themeColor="accent1" w:themeShade="bf" w:val="0F4761"/>
+    <w:rsid w:val="004326A8"/>
+    <w:rPr>
+      <w:rFonts w:asciiTheme="majorHAnsi" w:eastAsiaTheme="majorEastAsia" w:hAnsiTheme="majorHAnsi" w:cstheme="majorBidi"/>
+      <w:color w:val="0F4761" w:themeColor="accent1" w:themeShade="BF"/>
       <w:sz w:val="40"/>
       <w:szCs w:val="40"/>
     </w:rPr>
   </w:style>
-  <w:style w:type="character" w:styleId="Heading3Char" w:customStyle="1">
+  <w:style w:type="character" w:customStyle="1" w:styleId="Heading3Char">
     <w:name w:val="Heading 3 Char"/>
     <w:basedOn w:val="DefaultParagraphFont"/>
     <w:link w:val="Heading3"/>
     <w:uiPriority w:val="9"/>
     <w:semiHidden/>
     <w:qFormat/>
-    <w:rsid w:val="004326a8"/>
-    <w:rPr>
-      <w:rFonts w:ascii="等线 Light" w:hAnsi="等线 Light" w:eastAsia="等线 Light" w:cs="" w:asciiTheme="majorHAnsi" w:cstheme="majorBidi" w:eastAsiaTheme="majorEastAsia" w:hAnsiTheme="majorHAnsi"/>
-      <w:color w:themeColor="accent1" w:themeShade="bf" w:val="0F4761"/>
+    <w:rsid w:val="004326A8"/>
+    <w:rPr>
+      <w:rFonts w:asciiTheme="majorHAnsi" w:eastAsiaTheme="majorEastAsia" w:hAnsiTheme="majorHAnsi" w:cstheme="majorBidi"/>
+      <w:color w:val="0F4761" w:themeColor="accent1" w:themeShade="BF"/>
       <w:sz w:val="32"/>
       <w:szCs w:val="32"/>
     </w:rPr>
   </w:style>
-  <w:style w:type="character" w:styleId="Heading4Char" w:customStyle="1">
+  <w:style w:type="character" w:customStyle="1" w:styleId="Heading4Char">
     <w:name w:val="Heading 4 Char"/>
     <w:basedOn w:val="DefaultParagraphFont"/>
     <w:link w:val="Heading4"/>
     <w:uiPriority w:val="9"/>
     <w:semiHidden/>
     <w:qFormat/>
-    <w:rsid w:val="004326a8"/>
-    <w:rPr>
-      <w:rFonts w:cs="" w:cstheme="majorBidi"/>
-      <w:color w:themeColor="accent1" w:themeShade="bf" w:val="0F4761"/>
+    <w:rsid w:val="004326A8"/>
+    <w:rPr>
+      <w:rFonts w:cstheme="majorBidi"/>
+      <w:color w:val="0F4761" w:themeColor="accent1" w:themeShade="BF"/>
       <w:sz w:val="28"/>
       <w:szCs w:val="28"/>
     </w:rPr>
   </w:style>
-  <w:style w:type="character" w:styleId="Heading5Char" w:customStyle="1">
+  <w:style w:type="character" w:customStyle="1" w:styleId="Heading5Char">
     <w:name w:val="Heading 5 Char"/>
     <w:basedOn w:val="DefaultParagraphFont"/>
     <w:link w:val="Heading5"/>
     <w:uiPriority w:val="9"/>
     <w:semiHidden/>
     <w:qFormat/>
-    <w:rsid w:val="004326a8"/>
-    <w:rPr>
-      <w:rFonts w:cs="" w:cstheme="majorBidi"/>
-      <w:color w:themeColor="accent1" w:themeShade="bf" w:val="0F4761"/>
+    <w:rsid w:val="004326A8"/>
+    <w:rPr>
+      <w:rFonts w:cstheme="majorBidi"/>
+      <w:color w:val="0F4761" w:themeColor="accent1" w:themeShade="BF"/>
       <w:sz w:val="24"/>
     </w:rPr>
   </w:style>
-  <w:style w:type="character" w:styleId="Heading6Char" w:customStyle="1">
+  <w:style w:type="character" w:customStyle="1" w:styleId="Heading6Char">
     <w:name w:val="Heading 6 Char"/>
     <w:basedOn w:val="DefaultParagraphFont"/>
     <w:link w:val="Heading6"/>
     <w:uiPriority w:val="9"/>
     <w:semiHidden/>
     <w:qFormat/>
-    <w:rsid w:val="004326a8"/>
-    <w:rPr>
-      <w:rFonts w:cs="" w:cstheme="majorBidi"/>
+    <w:rsid w:val="004326A8"/>
+    <w:rPr>
+      <w:rFonts w:cstheme="majorBidi"/>
       <w:b/>
       <w:bCs/>
-      <w:color w:themeColor="accent1" w:themeShade="bf" w:val="0F4761"/>
-    </w:rPr>
-  </w:style>
-  <w:style w:type="character" w:styleId="Heading7Char" w:customStyle="1">
+      <w:color w:val="0F4761" w:themeColor="accent1" w:themeShade="BF"/>
+    </w:rPr>
+  </w:style>
+  <w:style w:type="character" w:customStyle="1" w:styleId="Heading7Char">
     <w:name w:val="Heading 7 Char"/>
     <w:basedOn w:val="DefaultParagraphFont"/>
     <w:link w:val="Heading7"/>
     <w:uiPriority w:val="9"/>
     <w:semiHidden/>
     <w:qFormat/>
-    <w:rsid w:val="004326a8"/>
-    <w:rPr>
-      <w:rFonts w:cs="" w:cstheme="majorBidi"/>
+    <w:rsid w:val="004326A8"/>
+    <w:rPr>
+      <w:rFonts w:cstheme="majorBidi"/>
       <w:b/>
       <w:bCs/>
-      <w:color w:themeColor="text1" w:themeTint="a6" w:val="595959"/>
-    </w:rPr>
-  </w:style>
-  <w:style w:type="character" w:styleId="Heading8Char" w:customStyle="1">
+      <w:color w:val="595959" w:themeColor="text1" w:themeTint="A6"/>
+    </w:rPr>
+  </w:style>
+  <w:style w:type="character" w:customStyle="1" w:styleId="Heading8Char">
     <w:name w:val="Heading 8 Char"/>
     <w:basedOn w:val="DefaultParagraphFont"/>
     <w:link w:val="Heading8"/>
     <w:uiPriority w:val="9"/>
     <w:semiHidden/>
     <w:qFormat/>
-    <w:rsid w:val="004326a8"/>
-    <w:rPr>
-      <w:rFonts w:cs="" w:cstheme="majorBidi"/>
-      <w:color w:themeColor="text1" w:themeTint="a6" w:val="595959"/>
-    </w:rPr>
-  </w:style>
-  <w:style w:type="character" w:styleId="Heading9Char" w:customStyle="1">
+    <w:rsid w:val="004326A8"/>
+    <w:rPr>
+      <w:rFonts w:cstheme="majorBidi"/>
+      <w:color w:val="595959" w:themeColor="text1" w:themeTint="A6"/>
+    </w:rPr>
+  </w:style>
+  <w:style w:type="character" w:customStyle="1" w:styleId="Heading9Char">
     <w:name w:val="Heading 9 Char"/>
     <w:basedOn w:val="DefaultParagraphFont"/>
     <w:link w:val="Heading9"/>
     <w:uiPriority w:val="9"/>
     <w:semiHidden/>
     <w:qFormat/>
-    <w:rsid w:val="004326a8"/>
-    <w:rPr>
-      <w:rFonts w:eastAsia="等线 Light" w:cs="" w:cstheme="majorBidi" w:eastAsiaTheme="majorEastAsia"/>
-      <w:color w:themeColor="text1" w:themeTint="a6" w:val="595959"/>
-    </w:rPr>
-  </w:style>
-  <w:style w:type="character" w:styleId="TitleChar" w:customStyle="1">
+    <w:rsid w:val="004326A8"/>
+    <w:rPr>
+      <w:rFonts w:eastAsiaTheme="majorEastAsia" w:cstheme="majorBidi"/>
+      <w:color w:val="595959" w:themeColor="text1" w:themeTint="A6"/>
+    </w:rPr>
+  </w:style>
+  <w:style w:type="character" w:customStyle="1" w:styleId="TitleChar">
     <w:name w:val="Title Char"/>
     <w:basedOn w:val="DefaultParagraphFont"/>
     <w:link w:val="Title"/>
     <w:uiPriority w:val="10"/>
     <w:qFormat/>
-    <w:rsid w:val="004326a8"/>
-    <w:rPr>
-      <w:rFonts w:ascii="等线 Light" w:hAnsi="等线 Light" w:eastAsia="等线 Light" w:cs="" w:asciiTheme="majorHAnsi" w:cstheme="majorBidi" w:eastAsiaTheme="majorEastAsia" w:hAnsiTheme="majorHAnsi"/>
+    <w:rsid w:val="004326A8"/>
+    <w:rPr>
+      <w:rFonts w:asciiTheme="majorHAnsi" w:eastAsiaTheme="majorEastAsia" w:hAnsiTheme="majorHAnsi" w:cstheme="majorBidi"/>
       <w:spacing w:val="-10"/>
       <w:kern w:val="2"/>
       <w:sz w:val="56"/>
       <w:szCs w:val="56"/>
     </w:rPr>
   </w:style>
-  <w:style w:type="character" w:styleId="SubtitleChar" w:customStyle="1">
+  <w:style w:type="character" w:customStyle="1" w:styleId="SubtitleChar">
     <w:name w:val="Subtitle Char"/>
     <w:basedOn w:val="DefaultParagraphFont"/>
     <w:link w:val="Subtitle"/>
     <w:uiPriority w:val="11"/>
     <w:qFormat/>
-    <w:rsid w:val="004326a8"/>
-    <w:rPr>
-      <w:rFonts w:ascii="等线 Light" w:hAnsi="等线 Light" w:eastAsia="等线 Light" w:cs="" w:asciiTheme="majorHAnsi" w:cstheme="majorBidi" w:eastAsiaTheme="majorEastAsia" w:hAnsiTheme="majorHAnsi"/>
-      <w:color w:themeColor="text1" w:themeTint="a6" w:val="595959"/>
+    <w:rsid w:val="004326A8"/>
+    <w:rPr>
+      <w:rFonts w:asciiTheme="majorHAnsi" w:eastAsiaTheme="majorEastAsia" w:hAnsiTheme="majorHAnsi" w:cstheme="majorBidi"/>
+      <w:color w:val="595959" w:themeColor="text1" w:themeTint="A6"/>
       <w:spacing w:val="15"/>
       <w:sz w:val="28"/>
       <w:szCs w:val="28"/>
     </w:rPr>
   </w:style>
-  <w:style w:type="character" w:styleId="QuoteChar" w:customStyle="1">
+  <w:style w:type="character" w:customStyle="1" w:styleId="QuoteChar">
     <w:name w:val="Quote Char"/>
     <w:basedOn w:val="DefaultParagraphFont"/>
     <w:link w:val="Quote"/>
     <w:uiPriority w:val="29"/>
     <w:qFormat/>
-    <w:rsid w:val="004326a8"/>
+    <w:rsid w:val="004326A8"/>
     <w:rPr>
       <w:i/>
       <w:iCs/>
-      <w:color w:themeColor="text1" w:themeTint="bf" w:val="404040"/>
+      <w:color w:val="404040" w:themeColor="text1" w:themeTint="BF"/>
     </w:rPr>
   </w:style>
   <w:style w:type="character" w:styleId="IntenseEmphasis">
@@ -1480,24 +1642,24 @@
     <w:basedOn w:val="DefaultParagraphFont"/>
     <w:uiPriority w:val="21"/>
     <w:qFormat/>
-    <w:rsid w:val="004326a8"/>
+    <w:rsid w:val="004326A8"/>
     <w:rPr>
       <w:i/>
       <w:iCs/>
-      <w:color w:themeColor="accent1" w:themeShade="bf" w:val="0F4761"/>
-    </w:rPr>
-  </w:style>
-  <w:style w:type="character" w:styleId="IntenseQuoteChar" w:customStyle="1">
+      <w:color w:val="0F4761" w:themeColor="accent1" w:themeShade="BF"/>
+    </w:rPr>
+  </w:style>
+  <w:style w:type="character" w:customStyle="1" w:styleId="IntenseQuoteChar">
     <w:name w:val="Intense Quote Char"/>
     <w:basedOn w:val="DefaultParagraphFont"/>
     <w:link w:val="IntenseQuote"/>
     <w:uiPriority w:val="30"/>
     <w:qFormat/>
-    <w:rsid w:val="004326a8"/>
+    <w:rsid w:val="004326A8"/>
     <w:rPr>
       <w:i/>
       <w:iCs/>
-      <w:color w:themeColor="accent1" w:themeShade="bf" w:val="0F4761"/>
+      <w:color w:val="0F4761" w:themeColor="accent1" w:themeShade="BF"/>
     </w:rPr>
   </w:style>
   <w:style w:type="character" w:styleId="IntenseReference">
@@ -1505,16 +1667,16 @@
     <w:basedOn w:val="DefaultParagraphFont"/>
     <w:uiPriority w:val="32"/>
     <w:qFormat/>
-    <w:rsid w:val="004326a8"/>
+    <w:rsid w:val="004326A8"/>
     <w:rPr>
       <w:b/>
       <w:bCs/>
       <w:smallCaps/>
-      <w:color w:themeColor="accent1" w:themeShade="bf" w:val="0F4761"/>
+      <w:color w:val="0F4761" w:themeColor="accent1" w:themeShade="BF"/>
       <w:spacing w:val="5"/>
     </w:rPr>
   </w:style>
-  <w:style w:type="character" w:styleId="HeaderChar" w:customStyle="1">
+  <w:style w:type="character" w:customStyle="1" w:styleId="HeaderChar">
     <w:name w:val="Header Char"/>
     <w:basedOn w:val="DefaultParagraphFont"/>
     <w:link w:val="Header"/>
@@ -1526,7 +1688,7 @@
       <w:szCs w:val="18"/>
     </w:rPr>
   </w:style>
-  <w:style w:type="character" w:styleId="FooterChar" w:customStyle="1">
+  <w:style w:type="character" w:customStyle="1" w:styleId="FooterChar">
     <w:name w:val="Footer Char"/>
     <w:basedOn w:val="DefaultParagraphFont"/>
     <w:link w:val="Footer"/>
@@ -1538,17 +1700,17 @@
       <w:szCs w:val="18"/>
     </w:rPr>
   </w:style>
-  <w:style w:type="paragraph" w:styleId="Heading">
+  <w:style w:type="paragraph" w:customStyle="1" w:styleId="Heading">
     <w:name w:val="Heading"/>
     <w:basedOn w:val="Normal"/>
     <w:next w:val="BodyText"/>
     <w:qFormat/>
     <w:pPr>
-      <w:keepNext w:val="true"/>
+      <w:keepNext/>
       <w:spacing w:before="240" w:after="120"/>
     </w:pPr>
     <w:rPr>
-      <w:rFonts w:ascii="Liberation Sans" w:hAnsi="Liberation Sans" w:eastAsia="Noto Sans CJK SC" w:cs="Noto Sans Devanagari"/>
+      <w:rFonts w:ascii="Liberation Sans" w:eastAsia="Noto Sans CJK SC" w:hAnsi="Liberation Sans" w:cs="Noto Sans Devanagari"/>
       <w:sz w:val="28"/>
       <w:szCs w:val="28"/>
     </w:rPr>
@@ -1557,14 +1719,12 @@
     <w:name w:val="Body Text"/>
     <w:basedOn w:val="Normal"/>
     <w:pPr>
-      <w:spacing w:lineRule="auto" w:line="276" w:before="0" w:after="140"/>
+      <w:spacing w:after="140" w:line="276" w:lineRule="auto"/>
     </w:pPr>
-    <w:rPr/>
   </w:style>
   <w:style w:type="paragraph" w:styleId="List">
     <w:name w:val="List"/>
     <w:basedOn w:val="BodyText"/>
-    <w:pPr/>
     <w:rPr>
       <w:rFonts w:cs="Noto Sans Devanagari"/>
     </w:rPr>
@@ -1582,10 +1742,9 @@
       <w:i/>
       <w:iCs/>
       <w:sz w:val="24"/>
-      <w:szCs w:val="24"/>
-    </w:rPr>
-  </w:style>
-  <w:style w:type="paragraph" w:styleId="Index">
+    </w:rPr>
+  </w:style>
+  <w:style w:type="paragraph" w:customStyle="1" w:styleId="Index">
     <w:name w:val="Index"/>
     <w:basedOn w:val="Normal"/>
     <w:qFormat/>
@@ -1603,16 +1762,15 @@
     <w:link w:val="TitleChar"/>
     <w:uiPriority w:val="10"/>
     <w:qFormat/>
-    <w:rsid w:val="004326a8"/>
+    <w:rsid w:val="004326A8"/>
     <w:pPr>
-      <w:spacing w:lineRule="auto" w:line="240" w:before="0" w:after="80"/>
+      <w:spacing w:after="80" w:line="240" w:lineRule="auto"/>
       <w:contextualSpacing/>
       <w:jc w:val="center"/>
     </w:pPr>
     <w:rPr>
-      <w:rFonts w:ascii="等线 Light" w:hAnsi="等线 Light" w:eastAsia="等线 Light" w:cs="" w:asciiTheme="majorHAnsi" w:cstheme="majorBidi" w:eastAsiaTheme="majorEastAsia" w:hAnsiTheme="majorHAnsi"/>
+      <w:rFonts w:asciiTheme="majorHAnsi" w:eastAsiaTheme="majorEastAsia" w:hAnsiTheme="majorHAnsi" w:cstheme="majorBidi"/>
       <w:spacing w:val="-10"/>
-      <w:kern w:val="2"/>
       <w:sz w:val="56"/>
       <w:szCs w:val="56"/>
     </w:rPr>
@@ -1624,13 +1782,13 @@
     <w:link w:val="SubtitleChar"/>
     <w:uiPriority w:val="11"/>
     <w:qFormat/>
-    <w:rsid w:val="004326a8"/>
+    <w:rsid w:val="004326A8"/>
     <w:pPr>
       <w:jc w:val="center"/>
     </w:pPr>
     <w:rPr>
-      <w:rFonts w:ascii="等线 Light" w:hAnsi="等线 Light" w:eastAsia="等线 Light" w:cs="" w:asciiTheme="majorHAnsi" w:cstheme="majorBidi" w:eastAsiaTheme="majorEastAsia" w:hAnsiTheme="majorHAnsi"/>
-      <w:color w:themeColor="text1" w:themeTint="a6" w:val="595959"/>
+      <w:rFonts w:asciiTheme="majorHAnsi" w:eastAsiaTheme="majorEastAsia" w:hAnsiTheme="majorHAnsi" w:cstheme="majorBidi"/>
+      <w:color w:val="595959" w:themeColor="text1" w:themeTint="A6"/>
       <w:spacing w:val="15"/>
       <w:sz w:val="28"/>
       <w:szCs w:val="28"/>
@@ -1643,15 +1801,15 @@
     <w:link w:val="QuoteChar"/>
     <w:uiPriority w:val="29"/>
     <w:qFormat/>
-    <w:rsid w:val="004326a8"/>
+    <w:rsid w:val="004326A8"/>
     <w:pPr>
-      <w:spacing w:before="160" w:after="160"/>
+      <w:spacing w:before="160"/>
       <w:jc w:val="center"/>
     </w:pPr>
     <w:rPr>
       <w:i/>
       <w:iCs/>
-      <w:color w:themeColor="text1" w:themeTint="bf" w:val="404040"/>
+      <w:color w:val="404040" w:themeColor="text1" w:themeTint="BF"/>
     </w:rPr>
   </w:style>
   <w:style w:type="paragraph" w:styleId="ListParagraph">
@@ -1659,13 +1817,11 @@
     <w:basedOn w:val="Normal"/>
     <w:uiPriority w:val="34"/>
     <w:qFormat/>
-    <w:rsid w:val="004326a8"/>
+    <w:rsid w:val="004326A8"/>
     <w:pPr>
-      <w:spacing w:before="0" w:after="160"/>
-      <w:ind w:start="720"/>
+      <w:ind w:left="720"/>
       <w:contextualSpacing/>
     </w:pPr>
-    <w:rPr/>
   </w:style>
   <w:style w:type="paragraph" w:styleId="IntenseQuote">
     <w:name w:val="Intense Quote"/>
@@ -1674,28 +1830,26 @@
     <w:link w:val="IntenseQuoteChar"/>
     <w:uiPriority w:val="30"/>
     <w:qFormat/>
-    <w:rsid w:val="004326a8"/>
+    <w:rsid w:val="004326A8"/>
     <w:pPr>
       <w:pBdr>
-        <w:top w:val="single" w:sz="4" w:space="10" w:color="0F4761" w:themeColor="accent1" w:themeShade="bf"/>
-        <w:bottom w:val="single" w:sz="4" w:space="10" w:color="0F4761" w:themeColor="accent1" w:themeShade="bf"/>
+        <w:top w:val="single" w:sz="4" w:space="10" w:color="0F4761" w:themeColor="accent1" w:themeShade="BF"/>
+        <w:bottom w:val="single" w:sz="4" w:space="10" w:color="0F4761" w:themeColor="accent1" w:themeShade="BF"/>
       </w:pBdr>
       <w:spacing w:before="360" w:after="360"/>
-      <w:ind w:start="864" w:end="864"/>
+      <w:ind w:left="864" w:right="864"/>
       <w:jc w:val="center"/>
     </w:pPr>
     <w:rPr>
       <w:i/>
       <w:iCs/>
-      <w:color w:themeColor="accent1" w:themeShade="bf" w:val="0F4761"/>
-    </w:rPr>
-  </w:style>
-  <w:style w:type="paragraph" w:styleId="HeaderandFooter">
+      <w:color w:val="0F4761" w:themeColor="accent1" w:themeShade="BF"/>
+    </w:rPr>
+  </w:style>
+  <w:style w:type="paragraph" w:customStyle="1" w:styleId="HeaderandFooter">
     <w:name w:val="Header and Footer"/>
     <w:basedOn w:val="Normal"/>
     <w:qFormat/>
-    <w:pPr/>
-    <w:rPr/>
   </w:style>
   <w:style w:type="paragraph" w:styleId="Header">
     <w:name w:val="header"/>
@@ -1706,12 +1860,11 @@
     <w:rsid w:val="00114424"/>
     <w:pPr>
       <w:tabs>
-        <w:tab w:val="clear" w:pos="420"/>
-        <w:tab w:val="center" w:pos="4153" w:leader="none"/>
-        <w:tab w:val="right" w:pos="8306" w:leader="none"/>
+        <w:tab w:val="center" w:pos="4153"/>
+        <w:tab w:val="right" w:pos="8306"/>
       </w:tabs>
-      <w:snapToGrid w:val="false"/>
-      <w:spacing w:lineRule="auto" w:line="240"/>
+      <w:snapToGrid w:val="0"/>
+      <w:spacing w:line="240" w:lineRule="auto"/>
       <w:jc w:val="center"/>
     </w:pPr>
     <w:rPr>
@@ -1728,44 +1881,22 @@
     <w:rsid w:val="00114424"/>
     <w:pPr>
       <w:tabs>
-        <w:tab w:val="clear" w:pos="420"/>
-        <w:tab w:val="center" w:pos="4153" w:leader="none"/>
-        <w:tab w:val="right" w:pos="8306" w:leader="none"/>
+        <w:tab w:val="center" w:pos="4153"/>
+        <w:tab w:val="right" w:pos="8306"/>
       </w:tabs>
-      <w:snapToGrid w:val="false"/>
-      <w:spacing w:lineRule="auto" w:line="240"/>
+      <w:snapToGrid w:val="0"/>
+      <w:spacing w:line="240" w:lineRule="auto"/>
     </w:pPr>
     <w:rPr>
       <w:sz w:val="18"/>
       <w:szCs w:val="18"/>
     </w:rPr>
-  </w:style>
-  <w:style w:type="numbering" w:styleId="NoList" w:default="1">
-    <w:name w:val="No List"/>
-    <w:uiPriority w:val="99"/>
-    <w:semiHidden/>
-    <w:unhideWhenUsed/>
-    <w:qFormat/>
-  </w:style>
-  <w:style w:type="table" w:default="1" w:styleId="TableNormal">
-    <w:name w:val="Normal Table"/>
-    <w:uiPriority w:val="99"/>
-    <w:semiHidden/>
-    <w:unhideWhenUsed/>
-    <w:tblPr>
-      <w:tblCellMar>
-        <w:top w:w="0" w:type="dxa"/>
-        <w:left w:w="108" w:type="dxa"/>
-        <w:bottom w:w="0" w:type="dxa"/>
-        <w:right w:w="108" w:type="dxa"/>
-      </w:tblCellMar>
-    </w:tblPr>
   </w:style>
 </w:styles>
 </file>
 
 <file path=word/theme/theme1.xml><?xml version="1.0" encoding="utf-8"?>
-<a:theme xmlns:a="http://schemas.openxmlformats.org/drawingml/2006/main" xmlns:r="http://schemas.openxmlformats.org/officeDocument/2006/relationships" name="Office Theme">
+<a:theme xmlns:a="http://schemas.openxmlformats.org/drawingml/2006/main" name="Office Theme">
   <a:themeElements>
     <a:clrScheme name="Office">
       <a:dk1>
@@ -1807,12 +1938,12 @@
     </a:clrScheme>
     <a:fontScheme name="Office">
       <a:majorFont>
-        <a:latin typeface="等线 Light" panose="02110004020202020204" pitchFamily="0" charset="1"/>
+        <a:latin typeface="等线 Light" panose="02110004020202020204"/>
         <a:ea typeface=""/>
         <a:cs typeface=""/>
       </a:majorFont>
       <a:minorFont>
-        <a:latin typeface="等线" panose="02110004020202020204" pitchFamily="0" charset="1"/>
+        <a:latin typeface="等线" panose="02110004020202020204"/>
         <a:ea typeface=""/>
         <a:cs typeface=""/>
       </a:minorFont>
@@ -1844,7 +1975,7 @@
             </a:gs>
           </a:gsLst>
           <a:lin ang="5400000" scaled="0"/>
-          <a:tileRect l="0" t="0" r="0" b="0"/>
+          <a:tileRect/>
         </a:gradFill>
         <a:gradFill>
           <a:gsLst>
@@ -1868,7 +1999,7 @@
             </a:gs>
           </a:gsLst>
           <a:lin ang="5400000" scaled="0"/>
-          <a:tileRect l="0" t="0" r="0" b="0"/>
+          <a:tileRect/>
         </a:gradFill>
       </a:fillStyleLst>
       <a:lnStyleLst>
@@ -1928,10 +2059,12 @@
             </a:gs>
           </a:gsLst>
           <a:lin ang="5400000" scaled="0"/>
-          <a:tileRect l="0" t="0" r="0" b="0"/>
+          <a:tileRect/>
         </a:gradFill>
       </a:bgFillStyleLst>
     </a:fmtScheme>
   </a:themeElements>
+  <a:objectDefaults/>
+  <a:extraClrSchemeLst/>
 </a:theme>
 </file>
</xml_diff>